<commit_message>
Actualizacion del FD05 #7
</commit_message>
<xml_diff>
--- a/FD05-EPIS-Informe ProyectoFinal.docx
+++ b/FD05-EPIS-Informe ProyectoFinal.docx
@@ -1120,7 +1120,7 @@
     </w:p>
     <w:sdt>
       <w:sdtPr>
-        <w:id w:val="1632925131"/>
+        <w:id w:val="-1161707314"/>
         <w:docPartObj>
           <w:docPartGallery w:val="Table of Contents"/>
           <w:docPartUnique w:val="1"/>
@@ -1131,13 +1131,23 @@
           <w:pPr>
             <w:widowControl w:val="0"/>
             <w:tabs>
-              <w:tab w:val="right" w:leader="dot" w:pos="8503.511811023624"/>
+              <w:tab w:val="right" w:leader="dot" w:pos="12000"/>
             </w:tabs>
             <w:spacing w:after="0" w:before="60" w:line="240" w:lineRule="auto"/>
             <w:rPr>
-              <w:rFonts w:ascii="Times New Roman" w:cs="Times New Roman" w:eastAsia="Times New Roman" w:hAnsi="Times New Roman"/>
+              <w:rFonts w:ascii="Arial" w:cs="Arial" w:eastAsia="Arial" w:hAnsi="Arial"/>
+              <w:b w:val="1"/>
+              <w:bCs w:val="1"/>
+              <w:i w:val="0"/>
+              <w:iCs w:val="0"/>
+              <w:smallCaps w:val="0"/>
+              <w:strike w:val="0"/>
               <w:color w:val="000000"/>
+              <w:sz w:val="22"/>
+              <w:szCs w:val="22"/>
               <w:u w:val="none"/>
+              <w:shd w:fill="auto" w:val="clear"/>
+              <w:vertAlign w:val="baseline"/>
             </w:rPr>
           </w:pPr>
           <w:r>
@@ -1149,29 +1159,25 @@
             <w:r>
               <w:rPr>
                 <w:rFonts w:ascii="Times New Roman" w:cs="Times New Roman" w:eastAsia="Times New Roman" w:hAnsi="Times New Roman"/>
+                <w:b w:val="0"/>
+                <w:bCs w:val="0"/>
+                <w:i w:val="0"/>
+                <w:iCs w:val="0"/>
+                <w:smallCaps w:val="0"/>
+                <w:strike w:val="0"/>
                 <w:color w:val="000000"/>
+                <w:sz w:val="22"/>
+                <w:szCs w:val="22"/>
                 <w:u w:val="none"/>
+                <w:shd w:fill="auto" w:val="clear"/>
+                <w:vertAlign w:val="baseline"/>
                 <w:rtl w:val="0"/>
               </w:rPr>
               <w:t xml:space="preserve">1. Antecedentes</w:t>
               <w:tab/>
+              <w:t xml:space="preserve">3</w:t>
             </w:r>
           </w:hyperlink>
-          <w:r>
-            <w:fldChar w:fldCharType="begin"/>
-            <w:instrText xml:space="preserve"> PAGEREF _heading=h.fkg1ge1izhl1 \h </w:instrText>
-            <w:fldChar w:fldCharType="separate"/>
-          </w:r>
-          <w:r>
-            <w:rPr>
-              <w:rFonts w:ascii="Times New Roman" w:cs="Times New Roman" w:eastAsia="Times New Roman" w:hAnsi="Times New Roman"/>
-              <w:rtl w:val="0"/>
-            </w:rPr>
-            <w:t xml:space="preserve">3</w:t>
-          </w:r>
-          <w:r>
-            <w:fldChar w:fldCharType="end"/>
-          </w:r>
           <w:r>
             <w:rPr>
               <w:rtl w:val="0"/>
@@ -1182,42 +1188,48 @@
           <w:pPr>
             <w:widowControl w:val="0"/>
             <w:tabs>
-              <w:tab w:val="right" w:leader="dot" w:pos="8503.511811023624"/>
+              <w:tab w:val="right" w:leader="dot" w:pos="12000"/>
             </w:tabs>
             <w:spacing w:after="0" w:before="60" w:line="240" w:lineRule="auto"/>
             <w:rPr>
-              <w:rFonts w:ascii="Times New Roman" w:cs="Times New Roman" w:eastAsia="Times New Roman" w:hAnsi="Times New Roman"/>
+              <w:rFonts w:ascii="Arial" w:cs="Arial" w:eastAsia="Arial" w:hAnsi="Arial"/>
+              <w:b w:val="1"/>
+              <w:bCs w:val="1"/>
+              <w:i w:val="0"/>
+              <w:iCs w:val="0"/>
+              <w:smallCaps w:val="0"/>
+              <w:strike w:val="0"/>
               <w:color w:val="000000"/>
+              <w:sz w:val="22"/>
+              <w:szCs w:val="22"/>
               <w:u w:val="none"/>
+              <w:shd w:fill="auto" w:val="clear"/>
+              <w:vertAlign w:val="baseline"/>
             </w:rPr>
           </w:pPr>
           <w:hyperlink w:anchor="_heading=h.btt7mv5v4k1l">
             <w:r>
               <w:rPr>
                 <w:rFonts w:ascii="Times New Roman" w:cs="Times New Roman" w:eastAsia="Times New Roman" w:hAnsi="Times New Roman"/>
+                <w:b w:val="0"/>
+                <w:bCs w:val="0"/>
+                <w:i w:val="0"/>
+                <w:iCs w:val="0"/>
+                <w:smallCaps w:val="0"/>
+                <w:strike w:val="0"/>
                 <w:color w:val="000000"/>
+                <w:sz w:val="22"/>
+                <w:szCs w:val="22"/>
                 <w:u w:val="none"/>
+                <w:shd w:fill="auto" w:val="clear"/>
+                <w:vertAlign w:val="baseline"/>
                 <w:rtl w:val="0"/>
               </w:rPr>
               <w:t xml:space="preserve">2. Título</w:t>
               <w:tab/>
+              <w:t xml:space="preserve">3</w:t>
             </w:r>
           </w:hyperlink>
-          <w:r>
-            <w:fldChar w:fldCharType="begin"/>
-            <w:instrText xml:space="preserve"> PAGEREF _heading=h.btt7mv5v4k1l \h </w:instrText>
-            <w:fldChar w:fldCharType="separate"/>
-          </w:r>
-          <w:r>
-            <w:rPr>
-              <w:rFonts w:ascii="Times New Roman" w:cs="Times New Roman" w:eastAsia="Times New Roman" w:hAnsi="Times New Roman"/>
-              <w:rtl w:val="0"/>
-            </w:rPr>
-            <w:t xml:space="preserve">4</w:t>
-          </w:r>
-          <w:r>
-            <w:fldChar w:fldCharType="end"/>
-          </w:r>
           <w:r>
             <w:rPr>
               <w:rtl w:val="0"/>
@@ -1228,42 +1240,48 @@
           <w:pPr>
             <w:widowControl w:val="0"/>
             <w:tabs>
-              <w:tab w:val="right" w:leader="dot" w:pos="8503.511811023624"/>
+              <w:tab w:val="right" w:leader="dot" w:pos="12000"/>
             </w:tabs>
             <w:spacing w:after="0" w:before="60" w:line="240" w:lineRule="auto"/>
             <w:rPr>
-              <w:rFonts w:ascii="Times New Roman" w:cs="Times New Roman" w:eastAsia="Times New Roman" w:hAnsi="Times New Roman"/>
+              <w:rFonts w:ascii="Arial" w:cs="Arial" w:eastAsia="Arial" w:hAnsi="Arial"/>
+              <w:b w:val="1"/>
+              <w:bCs w:val="1"/>
+              <w:i w:val="0"/>
+              <w:iCs w:val="0"/>
+              <w:smallCaps w:val="0"/>
+              <w:strike w:val="0"/>
               <w:color w:val="000000"/>
+              <w:sz w:val="22"/>
+              <w:szCs w:val="22"/>
               <w:u w:val="none"/>
+              <w:shd w:fill="auto" w:val="clear"/>
+              <w:vertAlign w:val="baseline"/>
             </w:rPr>
           </w:pPr>
           <w:hyperlink w:anchor="_heading=h.5oac6jimoue">
             <w:r>
               <w:rPr>
                 <w:rFonts w:ascii="Times New Roman" w:cs="Times New Roman" w:eastAsia="Times New Roman" w:hAnsi="Times New Roman"/>
+                <w:b w:val="0"/>
+                <w:bCs w:val="0"/>
+                <w:i w:val="0"/>
+                <w:iCs w:val="0"/>
+                <w:smallCaps w:val="0"/>
+                <w:strike w:val="0"/>
                 <w:color w:val="000000"/>
+                <w:sz w:val="22"/>
+                <w:szCs w:val="22"/>
                 <w:u w:val="none"/>
+                <w:shd w:fill="auto" w:val="clear"/>
+                <w:vertAlign w:val="baseline"/>
                 <w:rtl w:val="0"/>
               </w:rPr>
               <w:t xml:space="preserve">3. Autores</w:t>
               <w:tab/>
+              <w:t xml:space="preserve">3</w:t>
             </w:r>
           </w:hyperlink>
-          <w:r>
-            <w:fldChar w:fldCharType="begin"/>
-            <w:instrText xml:space="preserve"> PAGEREF _heading=h.5oac6jimoue \h </w:instrText>
-            <w:fldChar w:fldCharType="separate"/>
-          </w:r>
-          <w:r>
-            <w:rPr>
-              <w:rFonts w:ascii="Times New Roman" w:cs="Times New Roman" w:eastAsia="Times New Roman" w:hAnsi="Times New Roman"/>
-              <w:rtl w:val="0"/>
-            </w:rPr>
-            <w:t xml:space="preserve">4</w:t>
-          </w:r>
-          <w:r>
-            <w:fldChar w:fldCharType="end"/>
-          </w:r>
           <w:r>
             <w:rPr>
               <w:rtl w:val="0"/>
@@ -1274,42 +1292,48 @@
           <w:pPr>
             <w:widowControl w:val="0"/>
             <w:tabs>
-              <w:tab w:val="right" w:leader="dot" w:pos="8503.511811023624"/>
+              <w:tab w:val="right" w:leader="dot" w:pos="12000"/>
             </w:tabs>
             <w:spacing w:after="0" w:before="60" w:line="240" w:lineRule="auto"/>
             <w:rPr>
-              <w:rFonts w:ascii="Times New Roman" w:cs="Times New Roman" w:eastAsia="Times New Roman" w:hAnsi="Times New Roman"/>
+              <w:rFonts w:ascii="Arial" w:cs="Arial" w:eastAsia="Arial" w:hAnsi="Arial"/>
+              <w:b w:val="1"/>
+              <w:bCs w:val="1"/>
+              <w:i w:val="0"/>
+              <w:iCs w:val="0"/>
+              <w:smallCaps w:val="0"/>
+              <w:strike w:val="0"/>
               <w:color w:val="000000"/>
+              <w:sz w:val="22"/>
+              <w:szCs w:val="22"/>
               <w:u w:val="none"/>
+              <w:shd w:fill="auto" w:val="clear"/>
+              <w:vertAlign w:val="baseline"/>
             </w:rPr>
           </w:pPr>
           <w:hyperlink w:anchor="_heading=h.ny5iwqfkh5rl">
             <w:r>
               <w:rPr>
                 <w:rFonts w:ascii="Times New Roman" w:cs="Times New Roman" w:eastAsia="Times New Roman" w:hAnsi="Times New Roman"/>
+                <w:b w:val="0"/>
+                <w:bCs w:val="0"/>
+                <w:i w:val="0"/>
+                <w:iCs w:val="0"/>
+                <w:smallCaps w:val="0"/>
+                <w:strike w:val="0"/>
                 <w:color w:val="000000"/>
+                <w:sz w:val="22"/>
+                <w:szCs w:val="22"/>
                 <w:u w:val="none"/>
+                <w:shd w:fill="auto" w:val="clear"/>
+                <w:vertAlign w:val="baseline"/>
                 <w:rtl w:val="0"/>
               </w:rPr>
               <w:t xml:space="preserve">4. Planteamiento del problema</w:t>
               <w:tab/>
+              <w:t xml:space="preserve">3</w:t>
             </w:r>
           </w:hyperlink>
-          <w:r>
-            <w:fldChar w:fldCharType="begin"/>
-            <w:instrText xml:space="preserve"> PAGEREF _heading=h.ny5iwqfkh5rl \h </w:instrText>
-            <w:fldChar w:fldCharType="separate"/>
-          </w:r>
-          <w:r>
-            <w:rPr>
-              <w:rFonts w:ascii="Times New Roman" w:cs="Times New Roman" w:eastAsia="Times New Roman" w:hAnsi="Times New Roman"/>
-              <w:rtl w:val="0"/>
-            </w:rPr>
-            <w:t xml:space="preserve">4</w:t>
-          </w:r>
-          <w:r>
-            <w:fldChar w:fldCharType="end"/>
-          </w:r>
           <w:r>
             <w:rPr>
               <w:rtl w:val="0"/>
@@ -1320,43 +1344,49 @@
           <w:pPr>
             <w:widowControl w:val="0"/>
             <w:tabs>
-              <w:tab w:val="right" w:leader="dot" w:pos="8503.511811023624"/>
+              <w:tab w:val="right" w:leader="dot" w:pos="12000"/>
             </w:tabs>
             <w:spacing w:after="0" w:before="60" w:line="240" w:lineRule="auto"/>
             <w:ind w:left="360" w:firstLine="0"/>
             <w:rPr>
-              <w:rFonts w:ascii="Times New Roman" w:cs="Times New Roman" w:eastAsia="Times New Roman" w:hAnsi="Times New Roman"/>
+              <w:rFonts w:ascii="Arial" w:cs="Arial" w:eastAsia="Arial" w:hAnsi="Arial"/>
+              <w:b w:val="0"/>
+              <w:bCs w:val="0"/>
+              <w:i w:val="0"/>
+              <w:iCs w:val="0"/>
+              <w:smallCaps w:val="0"/>
+              <w:strike w:val="0"/>
               <w:color w:val="000000"/>
+              <w:sz w:val="22"/>
+              <w:szCs w:val="22"/>
               <w:u w:val="none"/>
+              <w:shd w:fill="auto" w:val="clear"/>
+              <w:vertAlign w:val="baseline"/>
             </w:rPr>
           </w:pPr>
           <w:hyperlink w:anchor="_heading=h.95x8xnhymi32">
             <w:r>
               <w:rPr>
                 <w:rFonts w:ascii="Times New Roman" w:cs="Times New Roman" w:eastAsia="Times New Roman" w:hAnsi="Times New Roman"/>
+                <w:b w:val="0"/>
+                <w:bCs w:val="0"/>
+                <w:i w:val="0"/>
+                <w:iCs w:val="0"/>
+                <w:smallCaps w:val="0"/>
+                <w:strike w:val="0"/>
                 <w:color w:val="000000"/>
+                <w:sz w:val="22"/>
+                <w:szCs w:val="22"/>
                 <w:u w:val="none"/>
+                <w:shd w:fill="auto" w:val="clear"/>
+                <w:vertAlign w:val="baseline"/>
                 <w:rtl w:val="0"/>
               </w:rPr>
               <w:t xml:space="preserve">4.1. Problema</w:t>
               <w:tab/>
+              <w:t xml:space="preserve">3</w:t>
             </w:r>
           </w:hyperlink>
-          <w:r>
-            <w:fldChar w:fldCharType="begin"/>
-            <w:instrText xml:space="preserve"> PAGEREF _heading=h.95x8xnhymi32 \h </w:instrText>
-            <w:fldChar w:fldCharType="separate"/>
-          </w:r>
-          <w:r>
-            <w:rPr>
-              <w:rFonts w:ascii="Times New Roman" w:cs="Times New Roman" w:eastAsia="Times New Roman" w:hAnsi="Times New Roman"/>
-              <w:rtl w:val="0"/>
-            </w:rPr>
-            <w:t xml:space="preserve">4</w:t>
-          </w:r>
-          <w:r>
-            <w:fldChar w:fldCharType="end"/>
-          </w:r>
           <w:r>
             <w:rPr>
               <w:rtl w:val="0"/>
@@ -1367,43 +1397,49 @@
           <w:pPr>
             <w:widowControl w:val="0"/>
             <w:tabs>
-              <w:tab w:val="right" w:leader="dot" w:pos="8503.511811023624"/>
+              <w:tab w:val="right" w:leader="dot" w:pos="12000"/>
             </w:tabs>
             <w:spacing w:after="0" w:before="60" w:line="240" w:lineRule="auto"/>
             <w:ind w:left="360" w:firstLine="0"/>
             <w:rPr>
-              <w:rFonts w:ascii="Times New Roman" w:cs="Times New Roman" w:eastAsia="Times New Roman" w:hAnsi="Times New Roman"/>
+              <w:rFonts w:ascii="Arial" w:cs="Arial" w:eastAsia="Arial" w:hAnsi="Arial"/>
+              <w:b w:val="0"/>
+              <w:bCs w:val="0"/>
+              <w:i w:val="0"/>
+              <w:iCs w:val="0"/>
+              <w:smallCaps w:val="0"/>
+              <w:strike w:val="0"/>
               <w:color w:val="000000"/>
+              <w:sz w:val="22"/>
+              <w:szCs w:val="22"/>
               <w:u w:val="none"/>
+              <w:shd w:fill="auto" w:val="clear"/>
+              <w:vertAlign w:val="baseline"/>
             </w:rPr>
           </w:pPr>
           <w:hyperlink w:anchor="_heading=h.udenkk2zwzk0">
             <w:r>
               <w:rPr>
                 <w:rFonts w:ascii="Times New Roman" w:cs="Times New Roman" w:eastAsia="Times New Roman" w:hAnsi="Times New Roman"/>
+                <w:b w:val="0"/>
+                <w:bCs w:val="0"/>
+                <w:i w:val="0"/>
+                <w:iCs w:val="0"/>
+                <w:smallCaps w:val="0"/>
+                <w:strike w:val="0"/>
                 <w:color w:val="000000"/>
+                <w:sz w:val="22"/>
+                <w:szCs w:val="22"/>
                 <w:u w:val="none"/>
+                <w:shd w:fill="auto" w:val="clear"/>
+                <w:vertAlign w:val="baseline"/>
                 <w:rtl w:val="0"/>
               </w:rPr>
               <w:t xml:space="preserve">4.2. Justificación</w:t>
               <w:tab/>
+              <w:t xml:space="preserve">4</w:t>
             </w:r>
           </w:hyperlink>
-          <w:r>
-            <w:fldChar w:fldCharType="begin"/>
-            <w:instrText xml:space="preserve"> PAGEREF _heading=h.udenkk2zwzk0 \h </w:instrText>
-            <w:fldChar w:fldCharType="separate"/>
-          </w:r>
-          <w:r>
-            <w:rPr>
-              <w:rFonts w:ascii="Times New Roman" w:cs="Times New Roman" w:eastAsia="Times New Roman" w:hAnsi="Times New Roman"/>
-              <w:rtl w:val="0"/>
-            </w:rPr>
-            <w:t xml:space="preserve">4</w:t>
-          </w:r>
-          <w:r>
-            <w:fldChar w:fldCharType="end"/>
-          </w:r>
           <w:r>
             <w:rPr>
               <w:rtl w:val="0"/>
@@ -1414,43 +1450,49 @@
           <w:pPr>
             <w:widowControl w:val="0"/>
             <w:tabs>
-              <w:tab w:val="right" w:leader="dot" w:pos="8503.511811023624"/>
+              <w:tab w:val="right" w:leader="dot" w:pos="12000"/>
             </w:tabs>
             <w:spacing w:after="0" w:before="60" w:line="240" w:lineRule="auto"/>
             <w:ind w:left="360" w:firstLine="0"/>
             <w:rPr>
-              <w:rFonts w:ascii="Times New Roman" w:cs="Times New Roman" w:eastAsia="Times New Roman" w:hAnsi="Times New Roman"/>
+              <w:rFonts w:ascii="Arial" w:cs="Arial" w:eastAsia="Arial" w:hAnsi="Arial"/>
+              <w:b w:val="0"/>
+              <w:bCs w:val="0"/>
+              <w:i w:val="0"/>
+              <w:iCs w:val="0"/>
+              <w:smallCaps w:val="0"/>
+              <w:strike w:val="0"/>
               <w:color w:val="000000"/>
+              <w:sz w:val="22"/>
+              <w:szCs w:val="22"/>
               <w:u w:val="none"/>
+              <w:shd w:fill="auto" w:val="clear"/>
+              <w:vertAlign w:val="baseline"/>
             </w:rPr>
           </w:pPr>
           <w:hyperlink w:anchor="_heading=h.8gdykebzs8ef">
             <w:r>
               <w:rPr>
                 <w:rFonts w:ascii="Times New Roman" w:cs="Times New Roman" w:eastAsia="Times New Roman" w:hAnsi="Times New Roman"/>
+                <w:b w:val="0"/>
+                <w:bCs w:val="0"/>
+                <w:i w:val="0"/>
+                <w:iCs w:val="0"/>
+                <w:smallCaps w:val="0"/>
+                <w:strike w:val="0"/>
                 <w:color w:val="000000"/>
+                <w:sz w:val="22"/>
+                <w:szCs w:val="22"/>
                 <w:u w:val="none"/>
+                <w:shd w:fill="auto" w:val="clear"/>
+                <w:vertAlign w:val="baseline"/>
                 <w:rtl w:val="0"/>
               </w:rPr>
               <w:t xml:space="preserve">4.3. Alcance</w:t>
               <w:tab/>
+              <w:t xml:space="preserve">4</w:t>
             </w:r>
           </w:hyperlink>
-          <w:r>
-            <w:fldChar w:fldCharType="begin"/>
-            <w:instrText xml:space="preserve"> PAGEREF _heading=h.8gdykebzs8ef \h </w:instrText>
-            <w:fldChar w:fldCharType="separate"/>
-          </w:r>
-          <w:r>
-            <w:rPr>
-              <w:rFonts w:ascii="Times New Roman" w:cs="Times New Roman" w:eastAsia="Times New Roman" w:hAnsi="Times New Roman"/>
-              <w:rtl w:val="0"/>
-            </w:rPr>
-            <w:t xml:space="preserve">5</w:t>
-          </w:r>
-          <w:r>
-            <w:fldChar w:fldCharType="end"/>
-          </w:r>
           <w:r>
             <w:rPr>
               <w:rtl w:val="0"/>
@@ -1461,42 +1503,48 @@
           <w:pPr>
             <w:widowControl w:val="0"/>
             <w:tabs>
-              <w:tab w:val="right" w:leader="dot" w:pos="8503.511811023624"/>
+              <w:tab w:val="right" w:leader="dot" w:pos="12000"/>
             </w:tabs>
             <w:spacing w:after="0" w:before="60" w:line="240" w:lineRule="auto"/>
             <w:rPr>
-              <w:rFonts w:ascii="Times New Roman" w:cs="Times New Roman" w:eastAsia="Times New Roman" w:hAnsi="Times New Roman"/>
+              <w:rFonts w:ascii="Arial" w:cs="Arial" w:eastAsia="Arial" w:hAnsi="Arial"/>
+              <w:b w:val="1"/>
+              <w:bCs w:val="1"/>
+              <w:i w:val="0"/>
+              <w:iCs w:val="0"/>
+              <w:smallCaps w:val="0"/>
+              <w:strike w:val="0"/>
               <w:color w:val="000000"/>
+              <w:sz w:val="22"/>
+              <w:szCs w:val="22"/>
               <w:u w:val="none"/>
+              <w:shd w:fill="auto" w:val="clear"/>
+              <w:vertAlign w:val="baseline"/>
             </w:rPr>
           </w:pPr>
           <w:hyperlink w:anchor="_heading=h.fugd4ibf2h42">
             <w:r>
               <w:rPr>
                 <w:rFonts w:ascii="Times New Roman" w:cs="Times New Roman" w:eastAsia="Times New Roman" w:hAnsi="Times New Roman"/>
+                <w:b w:val="0"/>
+                <w:bCs w:val="0"/>
+                <w:i w:val="0"/>
+                <w:iCs w:val="0"/>
+                <w:smallCaps w:val="0"/>
+                <w:strike w:val="0"/>
                 <w:color w:val="000000"/>
+                <w:sz w:val="22"/>
+                <w:szCs w:val="22"/>
                 <w:u w:val="none"/>
+                <w:shd w:fill="auto" w:val="clear"/>
+                <w:vertAlign w:val="baseline"/>
                 <w:rtl w:val="0"/>
               </w:rPr>
               <w:t xml:space="preserve">5. Marco Teórico</w:t>
               <w:tab/>
+              <w:t xml:space="preserve">5</w:t>
             </w:r>
           </w:hyperlink>
-          <w:r>
-            <w:fldChar w:fldCharType="begin"/>
-            <w:instrText xml:space="preserve"> PAGEREF _heading=h.fugd4ibf2h42 \h </w:instrText>
-            <w:fldChar w:fldCharType="separate"/>
-          </w:r>
-          <w:r>
-            <w:rPr>
-              <w:rFonts w:ascii="Times New Roman" w:cs="Times New Roman" w:eastAsia="Times New Roman" w:hAnsi="Times New Roman"/>
-              <w:rtl w:val="0"/>
-            </w:rPr>
-            <w:t xml:space="preserve">5</w:t>
-          </w:r>
-          <w:r>
-            <w:fldChar w:fldCharType="end"/>
-          </w:r>
           <w:r>
             <w:rPr>
               <w:rtl w:val="0"/>
@@ -1507,42 +1555,48 @@
           <w:pPr>
             <w:widowControl w:val="0"/>
             <w:tabs>
-              <w:tab w:val="right" w:leader="dot" w:pos="8503.511811023624"/>
+              <w:tab w:val="right" w:leader="dot" w:pos="12000"/>
             </w:tabs>
             <w:spacing w:after="0" w:before="60" w:line="240" w:lineRule="auto"/>
             <w:rPr>
-              <w:rFonts w:ascii="Times New Roman" w:cs="Times New Roman" w:eastAsia="Times New Roman" w:hAnsi="Times New Roman"/>
+              <w:rFonts w:ascii="Arial" w:cs="Arial" w:eastAsia="Arial" w:hAnsi="Arial"/>
+              <w:b w:val="1"/>
+              <w:bCs w:val="1"/>
+              <w:i w:val="0"/>
+              <w:iCs w:val="0"/>
+              <w:smallCaps w:val="0"/>
+              <w:strike w:val="0"/>
               <w:color w:val="000000"/>
+              <w:sz w:val="22"/>
+              <w:szCs w:val="22"/>
               <w:u w:val="none"/>
+              <w:shd w:fill="auto" w:val="clear"/>
+              <w:vertAlign w:val="baseline"/>
             </w:rPr>
           </w:pPr>
           <w:hyperlink w:anchor="_heading=h.bnvrvos371x8">
             <w:r>
               <w:rPr>
                 <w:rFonts w:ascii="Times New Roman" w:cs="Times New Roman" w:eastAsia="Times New Roman" w:hAnsi="Times New Roman"/>
+                <w:b w:val="0"/>
+                <w:bCs w:val="0"/>
+                <w:i w:val="0"/>
+                <w:iCs w:val="0"/>
+                <w:smallCaps w:val="0"/>
+                <w:strike w:val="0"/>
                 <w:color w:val="000000"/>
+                <w:sz w:val="22"/>
+                <w:szCs w:val="22"/>
                 <w:u w:val="none"/>
+                <w:shd w:fill="auto" w:val="clear"/>
+                <w:vertAlign w:val="baseline"/>
                 <w:rtl w:val="0"/>
               </w:rPr>
               <w:t xml:space="preserve">6. Desarrollo de la solución</w:t>
               <w:tab/>
+              <w:t xml:space="preserve">6</w:t>
             </w:r>
           </w:hyperlink>
-          <w:r>
-            <w:fldChar w:fldCharType="begin"/>
-            <w:instrText xml:space="preserve"> PAGEREF _heading=h.bnvrvos371x8 \h </w:instrText>
-            <w:fldChar w:fldCharType="separate"/>
-          </w:r>
-          <w:r>
-            <w:rPr>
-              <w:rFonts w:ascii="Times New Roman" w:cs="Times New Roman" w:eastAsia="Times New Roman" w:hAnsi="Times New Roman"/>
-              <w:rtl w:val="0"/>
-            </w:rPr>
-            <w:t xml:space="preserve">6</w:t>
-          </w:r>
-          <w:r>
-            <w:fldChar w:fldCharType="end"/>
-          </w:r>
           <w:r>
             <w:rPr>
               <w:rtl w:val="0"/>
@@ -1553,43 +1607,49 @@
           <w:pPr>
             <w:widowControl w:val="0"/>
             <w:tabs>
-              <w:tab w:val="right" w:leader="dot" w:pos="8503.511811023624"/>
+              <w:tab w:val="right" w:leader="dot" w:pos="12000"/>
             </w:tabs>
             <w:spacing w:after="0" w:before="60" w:line="240" w:lineRule="auto"/>
             <w:ind w:left="360" w:firstLine="0"/>
             <w:rPr>
-              <w:rFonts w:ascii="Times New Roman" w:cs="Times New Roman" w:eastAsia="Times New Roman" w:hAnsi="Times New Roman"/>
+              <w:rFonts w:ascii="Arial" w:cs="Arial" w:eastAsia="Arial" w:hAnsi="Arial"/>
+              <w:b w:val="0"/>
+              <w:bCs w:val="0"/>
+              <w:i w:val="0"/>
+              <w:iCs w:val="0"/>
+              <w:smallCaps w:val="0"/>
+              <w:strike w:val="0"/>
               <w:color w:val="000000"/>
+              <w:sz w:val="22"/>
+              <w:szCs w:val="22"/>
               <w:u w:val="none"/>
+              <w:shd w:fill="auto" w:val="clear"/>
+              <w:vertAlign w:val="baseline"/>
             </w:rPr>
           </w:pPr>
           <w:hyperlink w:anchor="_heading=h.bcu50hpshgcr">
             <w:r>
               <w:rPr>
                 <w:rFonts w:ascii="Times New Roman" w:cs="Times New Roman" w:eastAsia="Times New Roman" w:hAnsi="Times New Roman"/>
+                <w:b w:val="0"/>
+                <w:bCs w:val="0"/>
+                <w:i w:val="0"/>
+                <w:iCs w:val="0"/>
+                <w:smallCaps w:val="0"/>
+                <w:strike w:val="0"/>
                 <w:color w:val="000000"/>
+                <w:sz w:val="22"/>
+                <w:szCs w:val="22"/>
                 <w:u w:val="none"/>
+                <w:shd w:fill="auto" w:val="clear"/>
+                <w:vertAlign w:val="baseline"/>
                 <w:rtl w:val="0"/>
               </w:rPr>
               <w:t xml:space="preserve">6.1. Análisis de Factibilidad (técnico, económico, operativa, social, legal, ambiental)</w:t>
               <w:tab/>
+              <w:t xml:space="preserve">6</w:t>
             </w:r>
           </w:hyperlink>
-          <w:r>
-            <w:fldChar w:fldCharType="begin"/>
-            <w:instrText xml:space="preserve"> PAGEREF _heading=h.bcu50hpshgcr \h </w:instrText>
-            <w:fldChar w:fldCharType="separate"/>
-          </w:r>
-          <w:r>
-            <w:rPr>
-              <w:rFonts w:ascii="Times New Roman" w:cs="Times New Roman" w:eastAsia="Times New Roman" w:hAnsi="Times New Roman"/>
-              <w:rtl w:val="0"/>
-            </w:rPr>
-            <w:t xml:space="preserve">6</w:t>
-          </w:r>
-          <w:r>
-            <w:fldChar w:fldCharType="end"/>
-          </w:r>
           <w:r>
             <w:rPr>
               <w:rtl w:val="0"/>
@@ -1600,43 +1660,49 @@
           <w:pPr>
             <w:widowControl w:val="0"/>
             <w:tabs>
-              <w:tab w:val="right" w:leader="dot" w:pos="8503.511811023624"/>
+              <w:tab w:val="right" w:leader="dot" w:pos="12000"/>
             </w:tabs>
             <w:spacing w:after="0" w:before="60" w:line="240" w:lineRule="auto"/>
             <w:ind w:left="360" w:firstLine="0"/>
             <w:rPr>
-              <w:rFonts w:ascii="Times New Roman" w:cs="Times New Roman" w:eastAsia="Times New Roman" w:hAnsi="Times New Roman"/>
+              <w:rFonts w:ascii="Arial" w:cs="Arial" w:eastAsia="Arial" w:hAnsi="Arial"/>
+              <w:b w:val="0"/>
+              <w:bCs w:val="0"/>
+              <w:i w:val="0"/>
+              <w:iCs w:val="0"/>
+              <w:smallCaps w:val="0"/>
+              <w:strike w:val="0"/>
               <w:color w:val="000000"/>
+              <w:sz w:val="22"/>
+              <w:szCs w:val="22"/>
               <w:u w:val="none"/>
+              <w:shd w:fill="auto" w:val="clear"/>
+              <w:vertAlign w:val="baseline"/>
             </w:rPr>
           </w:pPr>
           <w:hyperlink w:anchor="_heading=h.yodyjktd8uzr">
             <w:r>
               <w:rPr>
                 <w:rFonts w:ascii="Times New Roman" w:cs="Times New Roman" w:eastAsia="Times New Roman" w:hAnsi="Times New Roman"/>
+                <w:b w:val="0"/>
+                <w:bCs w:val="0"/>
+                <w:i w:val="0"/>
+                <w:iCs w:val="0"/>
+                <w:smallCaps w:val="0"/>
+                <w:strike w:val="0"/>
                 <w:color w:val="000000"/>
+                <w:sz w:val="22"/>
+                <w:szCs w:val="22"/>
                 <w:u w:val="none"/>
+                <w:shd w:fill="auto" w:val="clear"/>
+                <w:vertAlign w:val="baseline"/>
                 <w:rtl w:val="0"/>
               </w:rPr>
               <w:t xml:space="preserve">6.2. Tecnología de Desarrollo</w:t>
               <w:tab/>
+              <w:t xml:space="preserve">6</w:t>
             </w:r>
           </w:hyperlink>
-          <w:r>
-            <w:fldChar w:fldCharType="begin"/>
-            <w:instrText xml:space="preserve"> PAGEREF _heading=h.yodyjktd8uzr \h </w:instrText>
-            <w:fldChar w:fldCharType="separate"/>
-          </w:r>
-          <w:r>
-            <w:rPr>
-              <w:rFonts w:ascii="Times New Roman" w:cs="Times New Roman" w:eastAsia="Times New Roman" w:hAnsi="Times New Roman"/>
-              <w:rtl w:val="0"/>
-            </w:rPr>
-            <w:t xml:space="preserve">7</w:t>
-          </w:r>
-          <w:r>
-            <w:fldChar w:fldCharType="end"/>
-          </w:r>
           <w:r>
             <w:rPr>
               <w:rtl w:val="0"/>
@@ -1647,43 +1713,49 @@
           <w:pPr>
             <w:widowControl w:val="0"/>
             <w:tabs>
-              <w:tab w:val="right" w:leader="dot" w:pos="8503.511811023624"/>
+              <w:tab w:val="right" w:leader="dot" w:pos="12000"/>
             </w:tabs>
             <w:spacing w:after="0" w:before="60" w:line="240" w:lineRule="auto"/>
             <w:ind w:left="360" w:firstLine="0"/>
             <w:rPr>
-              <w:rFonts w:ascii="Times New Roman" w:cs="Times New Roman" w:eastAsia="Times New Roman" w:hAnsi="Times New Roman"/>
+              <w:rFonts w:ascii="Arial" w:cs="Arial" w:eastAsia="Arial" w:hAnsi="Arial"/>
+              <w:b w:val="0"/>
+              <w:bCs w:val="0"/>
+              <w:i w:val="0"/>
+              <w:iCs w:val="0"/>
+              <w:smallCaps w:val="0"/>
+              <w:strike w:val="0"/>
               <w:color w:val="000000"/>
+              <w:sz w:val="22"/>
+              <w:szCs w:val="22"/>
               <w:u w:val="none"/>
+              <w:shd w:fill="auto" w:val="clear"/>
+              <w:vertAlign w:val="baseline"/>
             </w:rPr>
           </w:pPr>
           <w:hyperlink w:anchor="_heading=h.e3v9j3qh7tci">
             <w:r>
               <w:rPr>
                 <w:rFonts w:ascii="Times New Roman" w:cs="Times New Roman" w:eastAsia="Times New Roman" w:hAnsi="Times New Roman"/>
+                <w:b w:val="0"/>
+                <w:bCs w:val="0"/>
+                <w:i w:val="0"/>
+                <w:iCs w:val="0"/>
+                <w:smallCaps w:val="0"/>
+                <w:strike w:val="0"/>
                 <w:color w:val="000000"/>
+                <w:sz w:val="22"/>
+                <w:szCs w:val="22"/>
                 <w:u w:val="none"/>
+                <w:shd w:fill="auto" w:val="clear"/>
+                <w:vertAlign w:val="baseline"/>
                 <w:rtl w:val="0"/>
               </w:rPr>
               <w:t xml:space="preserve">6.3. Metodología de implementación</w:t>
               <w:tab/>
+              <w:t xml:space="preserve">6</w:t>
             </w:r>
           </w:hyperlink>
-          <w:r>
-            <w:fldChar w:fldCharType="begin"/>
-            <w:instrText xml:space="preserve"> PAGEREF _heading=h.e3v9j3qh7tci \h </w:instrText>
-            <w:fldChar w:fldCharType="separate"/>
-          </w:r>
-          <w:r>
-            <w:rPr>
-              <w:rFonts w:ascii="Times New Roman" w:cs="Times New Roman" w:eastAsia="Times New Roman" w:hAnsi="Times New Roman"/>
-              <w:rtl w:val="0"/>
-            </w:rPr>
-            <w:t xml:space="preserve">7</w:t>
-          </w:r>
-          <w:r>
-            <w:fldChar w:fldCharType="end"/>
-          </w:r>
           <w:r>
             <w:rPr>
               <w:rtl w:val="0"/>
@@ -1694,42 +1766,48 @@
           <w:pPr>
             <w:widowControl w:val="0"/>
             <w:tabs>
-              <w:tab w:val="right" w:leader="dot" w:pos="8503.511811023624"/>
+              <w:tab w:val="right" w:leader="dot" w:pos="12000"/>
             </w:tabs>
             <w:spacing w:after="0" w:before="60" w:line="240" w:lineRule="auto"/>
             <w:rPr>
-              <w:rFonts w:ascii="Times New Roman" w:cs="Times New Roman" w:eastAsia="Times New Roman" w:hAnsi="Times New Roman"/>
+              <w:rFonts w:ascii="Arial" w:cs="Arial" w:eastAsia="Arial" w:hAnsi="Arial"/>
+              <w:b w:val="1"/>
+              <w:bCs w:val="1"/>
+              <w:i w:val="0"/>
+              <w:iCs w:val="0"/>
+              <w:smallCaps w:val="0"/>
+              <w:strike w:val="0"/>
               <w:color w:val="000000"/>
+              <w:sz w:val="22"/>
+              <w:szCs w:val="22"/>
               <w:u w:val="none"/>
+              <w:shd w:fill="auto" w:val="clear"/>
+              <w:vertAlign w:val="baseline"/>
             </w:rPr>
           </w:pPr>
-          <w:hyperlink w:anchor="_heading=h.73p9psqakasw">
+          <w:hyperlink w:anchor="_heading=h.6d1eogamqanj">
             <w:r>
               <w:rPr>
                 <w:rFonts w:ascii="Times New Roman" w:cs="Times New Roman" w:eastAsia="Times New Roman" w:hAnsi="Times New Roman"/>
+                <w:b w:val="0"/>
+                <w:bCs w:val="0"/>
+                <w:i w:val="0"/>
+                <w:iCs w:val="0"/>
+                <w:smallCaps w:val="0"/>
+                <w:strike w:val="0"/>
                 <w:color w:val="000000"/>
+                <w:sz w:val="22"/>
+                <w:szCs w:val="22"/>
                 <w:u w:val="none"/>
+                <w:shd w:fill="auto" w:val="clear"/>
+                <w:vertAlign w:val="baseline"/>
                 <w:rtl w:val="0"/>
               </w:rPr>
-              <w:t xml:space="preserve">7. Cronograma</w:t>
+              <w:t xml:space="preserve">7. Presupuesto</w:t>
               <w:tab/>
+              <w:t xml:space="preserve">7</w:t>
             </w:r>
           </w:hyperlink>
-          <w:r>
-            <w:fldChar w:fldCharType="begin"/>
-            <w:instrText xml:space="preserve"> PAGEREF _heading=h.73p9psqakasw \h </w:instrText>
-            <w:fldChar w:fldCharType="separate"/>
-          </w:r>
-          <w:r>
-            <w:rPr>
-              <w:rFonts w:ascii="Times New Roman" w:cs="Times New Roman" w:eastAsia="Times New Roman" w:hAnsi="Times New Roman"/>
-              <w:rtl w:val="0"/>
-            </w:rPr>
-            <w:t xml:space="preserve">8</w:t>
-          </w:r>
-          <w:r>
-            <w:fldChar w:fldCharType="end"/>
-          </w:r>
           <w:r>
             <w:rPr>
               <w:rtl w:val="0"/>
@@ -1740,42 +1818,48 @@
           <w:pPr>
             <w:widowControl w:val="0"/>
             <w:tabs>
-              <w:tab w:val="right" w:leader="dot" w:pos="8503.511811023624"/>
+              <w:tab w:val="right" w:leader="dot" w:pos="12000"/>
             </w:tabs>
             <w:spacing w:after="0" w:before="60" w:line="240" w:lineRule="auto"/>
             <w:rPr>
-              <w:rFonts w:ascii="Times New Roman" w:cs="Times New Roman" w:eastAsia="Times New Roman" w:hAnsi="Times New Roman"/>
+              <w:rFonts w:ascii="Arial" w:cs="Arial" w:eastAsia="Arial" w:hAnsi="Arial"/>
+              <w:b w:val="1"/>
+              <w:bCs w:val="1"/>
+              <w:i w:val="0"/>
+              <w:iCs w:val="0"/>
+              <w:smallCaps w:val="0"/>
+              <w:strike w:val="0"/>
               <w:color w:val="000000"/>
+              <w:sz w:val="22"/>
+              <w:szCs w:val="22"/>
               <w:u w:val="none"/>
+              <w:shd w:fill="auto" w:val="clear"/>
+              <w:vertAlign w:val="baseline"/>
             </w:rPr>
           </w:pPr>
-          <w:hyperlink w:anchor="_heading=h.6d1eogamqanj">
+          <w:hyperlink w:anchor="_heading=h.4446u0qmxo2v">
             <w:r>
               <w:rPr>
                 <w:rFonts w:ascii="Times New Roman" w:cs="Times New Roman" w:eastAsia="Times New Roman" w:hAnsi="Times New Roman"/>
+                <w:b w:val="0"/>
+                <w:bCs w:val="0"/>
+                <w:i w:val="0"/>
+                <w:iCs w:val="0"/>
+                <w:smallCaps w:val="0"/>
+                <w:strike w:val="0"/>
                 <w:color w:val="000000"/>
+                <w:sz w:val="22"/>
+                <w:szCs w:val="22"/>
                 <w:u w:val="none"/>
+                <w:shd w:fill="auto" w:val="clear"/>
+                <w:vertAlign w:val="baseline"/>
                 <w:rtl w:val="0"/>
               </w:rPr>
-              <w:t xml:space="preserve">8.  Presupuesto</w:t>
+              <w:t xml:space="preserve">8. Conclusiones y Recomendaciones</w:t>
               <w:tab/>
+              <w:t xml:space="preserve">8</w:t>
             </w:r>
           </w:hyperlink>
-          <w:r>
-            <w:fldChar w:fldCharType="begin"/>
-            <w:instrText xml:space="preserve"> PAGEREF _heading=h.6d1eogamqanj \h </w:instrText>
-            <w:fldChar w:fldCharType="separate"/>
-          </w:r>
-          <w:r>
-            <w:rPr>
-              <w:rFonts w:ascii="Times New Roman" w:cs="Times New Roman" w:eastAsia="Times New Roman" w:hAnsi="Times New Roman"/>
-              <w:rtl w:val="0"/>
-            </w:rPr>
-            <w:t xml:space="preserve">8</w:t>
-          </w:r>
-          <w:r>
-            <w:fldChar w:fldCharType="end"/>
-          </w:r>
           <w:r>
             <w:rPr>
               <w:rtl w:val="0"/>
@@ -1786,42 +1870,48 @@
           <w:pPr>
             <w:widowControl w:val="0"/>
             <w:tabs>
-              <w:tab w:val="right" w:leader="dot" w:pos="8503.511811023624"/>
+              <w:tab w:val="right" w:leader="dot" w:pos="12000"/>
             </w:tabs>
             <w:spacing w:after="0" w:before="60" w:line="240" w:lineRule="auto"/>
             <w:rPr>
-              <w:rFonts w:ascii="Times New Roman" w:cs="Times New Roman" w:eastAsia="Times New Roman" w:hAnsi="Times New Roman"/>
+              <w:rFonts w:ascii="Arial" w:cs="Arial" w:eastAsia="Arial" w:hAnsi="Arial"/>
+              <w:b w:val="1"/>
+              <w:bCs w:val="1"/>
+              <w:i w:val="0"/>
+              <w:iCs w:val="0"/>
+              <w:smallCaps w:val="0"/>
+              <w:strike w:val="0"/>
               <w:color w:val="000000"/>
+              <w:sz w:val="22"/>
+              <w:szCs w:val="22"/>
               <w:u w:val="none"/>
+              <w:shd w:fill="auto" w:val="clear"/>
+              <w:vertAlign w:val="baseline"/>
             </w:rPr>
           </w:pPr>
-          <w:hyperlink w:anchor="_heading=h.4446u0qmxo2v">
+          <w:hyperlink w:anchor="_heading=h.r0i4odm0dg04">
             <w:r>
               <w:rPr>
                 <w:rFonts w:ascii="Times New Roman" w:cs="Times New Roman" w:eastAsia="Times New Roman" w:hAnsi="Times New Roman"/>
+                <w:b w:val="0"/>
+                <w:bCs w:val="0"/>
+                <w:i w:val="0"/>
+                <w:iCs w:val="0"/>
+                <w:smallCaps w:val="0"/>
+                <w:strike w:val="0"/>
                 <w:color w:val="000000"/>
+                <w:sz w:val="22"/>
+                <w:szCs w:val="22"/>
                 <w:u w:val="none"/>
+                <w:shd w:fill="auto" w:val="clear"/>
+                <w:vertAlign w:val="baseline"/>
                 <w:rtl w:val="0"/>
               </w:rPr>
-              <w:t xml:space="preserve">9. Conclusiones y Recomendaciones</w:t>
+              <w:t xml:space="preserve">9. Bibliografía</w:t>
               <w:tab/>
+              <w:t xml:space="preserve">8</w:t>
             </w:r>
           </w:hyperlink>
-          <w:r>
-            <w:fldChar w:fldCharType="begin"/>
-            <w:instrText xml:space="preserve"> PAGEREF _heading=h.4446u0qmxo2v \h </w:instrText>
-            <w:fldChar w:fldCharType="separate"/>
-          </w:r>
-          <w:r>
-            <w:rPr>
-              <w:rFonts w:ascii="Times New Roman" w:cs="Times New Roman" w:eastAsia="Times New Roman" w:hAnsi="Times New Roman"/>
-              <w:rtl w:val="0"/>
-            </w:rPr>
-            <w:t xml:space="preserve">8</w:t>
-          </w:r>
-          <w:r>
-            <w:fldChar w:fldCharType="end"/>
-          </w:r>
           <w:r>
             <w:rPr>
               <w:rtl w:val="0"/>
@@ -1832,88 +1922,48 @@
           <w:pPr>
             <w:widowControl w:val="0"/>
             <w:tabs>
-              <w:tab w:val="right" w:leader="dot" w:pos="8503.511811023624"/>
+              <w:tab w:val="right" w:leader="dot" w:pos="12000"/>
             </w:tabs>
             <w:spacing w:after="0" w:before="60" w:line="240" w:lineRule="auto"/>
             <w:rPr>
-              <w:rFonts w:ascii="Times New Roman" w:cs="Times New Roman" w:eastAsia="Times New Roman" w:hAnsi="Times New Roman"/>
+              <w:rFonts w:ascii="Arial" w:cs="Arial" w:eastAsia="Arial" w:hAnsi="Arial"/>
+              <w:b w:val="1"/>
+              <w:bCs w:val="1"/>
+              <w:i w:val="0"/>
+              <w:iCs w:val="0"/>
+              <w:smallCaps w:val="0"/>
+              <w:strike w:val="0"/>
               <w:color w:val="000000"/>
+              <w:sz w:val="22"/>
+              <w:szCs w:val="22"/>
               <w:u w:val="none"/>
-            </w:rPr>
-          </w:pPr>
-          <w:hyperlink w:anchor="_heading=h.r0i4odm0dg04">
-            <w:r>
-              <w:rPr>
-                <w:rFonts w:ascii="Times New Roman" w:cs="Times New Roman" w:eastAsia="Times New Roman" w:hAnsi="Times New Roman"/>
-                <w:color w:val="000000"/>
-                <w:u w:val="none"/>
-                <w:rtl w:val="0"/>
-              </w:rPr>
-              <w:t xml:space="preserve">10. Bibliografía</w:t>
-              <w:tab/>
-            </w:r>
-          </w:hyperlink>
-          <w:r>
-            <w:fldChar w:fldCharType="begin"/>
-            <w:instrText xml:space="preserve"> PAGEREF _heading=h.r0i4odm0dg04 \h </w:instrText>
-            <w:fldChar w:fldCharType="separate"/>
-          </w:r>
-          <w:r>
-            <w:rPr>
-              <w:rFonts w:ascii="Times New Roman" w:cs="Times New Roman" w:eastAsia="Times New Roman" w:hAnsi="Times New Roman"/>
-              <w:rtl w:val="0"/>
-            </w:rPr>
-            <w:t xml:space="preserve">8</w:t>
-          </w:r>
-          <w:r>
-            <w:fldChar w:fldCharType="end"/>
-          </w:r>
-          <w:r>
-            <w:rPr>
-              <w:rtl w:val="0"/>
-            </w:rPr>
-          </w:r>
-        </w:p>
-        <w:p>
-          <w:pPr>
-            <w:widowControl w:val="0"/>
-            <w:tabs>
-              <w:tab w:val="right" w:leader="dot" w:pos="8503.511811023624"/>
-            </w:tabs>
-            <w:spacing w:after="0" w:before="60" w:line="240" w:lineRule="auto"/>
-            <w:rPr>
-              <w:rFonts w:ascii="Times New Roman" w:cs="Times New Roman" w:eastAsia="Times New Roman" w:hAnsi="Times New Roman"/>
-              <w:color w:val="000000"/>
-              <w:u w:val="none"/>
+              <w:shd w:fill="auto" w:val="clear"/>
+              <w:vertAlign w:val="baseline"/>
             </w:rPr>
           </w:pPr>
           <w:hyperlink w:anchor="_heading=h.ypysubjoqra8">
             <w:r>
               <w:rPr>
                 <w:rFonts w:ascii="Times New Roman" w:cs="Times New Roman" w:eastAsia="Times New Roman" w:hAnsi="Times New Roman"/>
+                <w:b w:val="0"/>
+                <w:bCs w:val="0"/>
+                <w:i w:val="0"/>
+                <w:iCs w:val="0"/>
+                <w:smallCaps w:val="0"/>
+                <w:strike w:val="0"/>
                 <w:color w:val="000000"/>
+                <w:sz w:val="22"/>
+                <w:szCs w:val="22"/>
                 <w:u w:val="none"/>
+                <w:shd w:fill="auto" w:val="clear"/>
+                <w:vertAlign w:val="baseline"/>
                 <w:rtl w:val="0"/>
               </w:rPr>
               <w:t xml:space="preserve">Anexos</w:t>
               <w:tab/>
+              <w:t xml:space="preserve">9</w:t>
             </w:r>
           </w:hyperlink>
-          <w:r>
-            <w:fldChar w:fldCharType="begin"/>
-            <w:instrText xml:space="preserve"> PAGEREF _heading=h.ypysubjoqra8 \h </w:instrText>
-            <w:fldChar w:fldCharType="separate"/>
-          </w:r>
-          <w:r>
-            <w:rPr>
-              <w:rFonts w:ascii="Times New Roman" w:cs="Times New Roman" w:eastAsia="Times New Roman" w:hAnsi="Times New Roman"/>
-              <w:rtl w:val="0"/>
-            </w:rPr>
-            <w:t xml:space="preserve">8</w:t>
-          </w:r>
-          <w:r>
-            <w:fldChar w:fldCharType="end"/>
-          </w:r>
           <w:r>
             <w:rPr>
               <w:rtl w:val="0"/>
@@ -2120,6 +2170,23 @@
     </w:p>
     <w:p>
       <w:pPr>
+        <w:jc w:val="left"/>
+        <w:rPr>
+          <w:b w:val="1"/>
+          <w:bCs w:val="1"/>
+          <w:sz w:val="24"/>
+          <w:szCs w:val="24"/>
+          <w:u w:val="single"/>
+        </w:rPr>
+      </w:pPr>
+      <w:r>
+        <w:rPr>
+          <w:rtl w:val="0"/>
+        </w:rPr>
+      </w:r>
+    </w:p>
+    <w:p>
+      <w:pPr>
         <w:pStyle w:val="Heading1"/>
         <w:jc w:val="both"/>
         <w:rPr>
@@ -2421,7 +2488,7 @@
       <w:pPr>
         <w:numPr>
           <w:ilvl w:val="0"/>
-          <w:numId w:val="5"/>
+          <w:numId w:val="7"/>
         </w:numPr>
         <w:spacing w:after="0" w:afterAutospacing="0"/>
         <w:ind w:left="720" w:hanging="360"/>
@@ -2446,7 +2513,7 @@
       <w:pPr>
         <w:numPr>
           <w:ilvl w:val="0"/>
-          <w:numId w:val="5"/>
+          <w:numId w:val="7"/>
         </w:numPr>
         <w:spacing w:after="0" w:afterAutospacing="0"/>
         <w:ind w:left="720" w:hanging="360"/>
@@ -2471,7 +2538,7 @@
       <w:pPr>
         <w:numPr>
           <w:ilvl w:val="0"/>
-          <w:numId w:val="5"/>
+          <w:numId w:val="7"/>
         </w:numPr>
         <w:ind w:left="720" w:hanging="360"/>
         <w:jc w:val="both"/>
@@ -2581,7 +2648,7 @@
     <w:sdt>
       <w:sdtPr>
         <w:lock w:val="contentLocked"/>
-        <w:id w:val="-839727852"/>
+        <w:id w:val="-920239433"/>
         <w:tag w:val="goog_rdk_0"/>
       </w:sdtPr>
       <w:sdtContent>
@@ -2938,7 +3005,7 @@
       <w:pPr>
         <w:numPr>
           <w:ilvl w:val="0"/>
-          <w:numId w:val="2"/>
+          <w:numId w:val="3"/>
         </w:numPr>
         <w:spacing w:after="0" w:afterAutospacing="0"/>
         <w:ind w:left="720" w:hanging="360"/>
@@ -2963,7 +3030,7 @@
       <w:pPr>
         <w:numPr>
           <w:ilvl w:val="0"/>
-          <w:numId w:val="2"/>
+          <w:numId w:val="3"/>
         </w:numPr>
         <w:spacing w:after="0" w:afterAutospacing="0"/>
         <w:ind w:left="720" w:hanging="360"/>
@@ -2988,7 +3055,7 @@
       <w:pPr>
         <w:numPr>
           <w:ilvl w:val="0"/>
-          <w:numId w:val="2"/>
+          <w:numId w:val="3"/>
         </w:numPr>
         <w:spacing w:after="0" w:afterAutospacing="0"/>
         <w:ind w:left="720" w:hanging="360"/>
@@ -3013,7 +3080,7 @@
       <w:pPr>
         <w:numPr>
           <w:ilvl w:val="0"/>
-          <w:numId w:val="2"/>
+          <w:numId w:val="3"/>
         </w:numPr>
         <w:spacing w:after="0" w:afterAutospacing="0"/>
         <w:ind w:left="720" w:hanging="360"/>
@@ -3038,7 +3105,7 @@
       <w:pPr>
         <w:numPr>
           <w:ilvl w:val="0"/>
-          <w:numId w:val="2"/>
+          <w:numId w:val="3"/>
         </w:numPr>
         <w:ind w:left="720" w:hanging="360"/>
         <w:jc w:val="both"/>
@@ -3081,7 +3148,7 @@
       <w:pPr>
         <w:numPr>
           <w:ilvl w:val="0"/>
-          <w:numId w:val="6"/>
+          <w:numId w:val="8"/>
         </w:numPr>
         <w:spacing w:after="0" w:afterAutospacing="0"/>
         <w:ind w:left="720" w:hanging="360"/>
@@ -3106,7 +3173,7 @@
       <w:pPr>
         <w:numPr>
           <w:ilvl w:val="0"/>
-          <w:numId w:val="6"/>
+          <w:numId w:val="8"/>
         </w:numPr>
         <w:spacing w:after="0" w:afterAutospacing="0"/>
         <w:ind w:left="720" w:hanging="360"/>
@@ -3131,7 +3198,7 @@
       <w:pPr>
         <w:numPr>
           <w:ilvl w:val="0"/>
-          <w:numId w:val="6"/>
+          <w:numId w:val="8"/>
         </w:numPr>
         <w:spacing w:after="0" w:afterAutospacing="0"/>
         <w:ind w:left="720" w:hanging="360"/>
@@ -3156,7 +3223,7 @@
       <w:pPr>
         <w:numPr>
           <w:ilvl w:val="0"/>
-          <w:numId w:val="6"/>
+          <w:numId w:val="8"/>
         </w:numPr>
         <w:ind w:left="720" w:hanging="360"/>
         <w:jc w:val="both"/>
@@ -3217,7 +3284,7 @@
     <w:sdt>
       <w:sdtPr>
         <w:lock w:val="contentLocked"/>
-        <w:id w:val="1066169983"/>
+        <w:id w:val="-166825437"/>
         <w:tag w:val="goog_rdk_1"/>
       </w:sdtPr>
       <w:sdtContent>
@@ -4383,7 +4450,7 @@
     <w:sdt>
       <w:sdtPr>
         <w:lock w:val="contentLocked"/>
-        <w:id w:val="1233593908"/>
+        <w:id w:val="887797677"/>
         <w:tag w:val="goog_rdk_2"/>
       </w:sdtPr>
       <w:sdtContent>
@@ -5162,7 +5229,7 @@
       <w:pPr>
         <w:numPr>
           <w:ilvl w:val="0"/>
-          <w:numId w:val="4"/>
+          <w:numId w:val="6"/>
         </w:numPr>
         <w:spacing w:after="0" w:afterAutospacing="0"/>
         <w:ind w:left="720" w:hanging="360"/>
@@ -5187,7 +5254,7 @@
       <w:pPr>
         <w:numPr>
           <w:ilvl w:val="0"/>
-          <w:numId w:val="4"/>
+          <w:numId w:val="6"/>
         </w:numPr>
         <w:spacing w:after="0" w:afterAutospacing="0"/>
         <w:ind w:left="720" w:hanging="360"/>
@@ -5212,7 +5279,7 @@
       <w:pPr>
         <w:numPr>
           <w:ilvl w:val="0"/>
-          <w:numId w:val="4"/>
+          <w:numId w:val="6"/>
         </w:numPr>
         <w:spacing w:after="0" w:afterAutospacing="0"/>
         <w:ind w:left="720" w:hanging="360"/>
@@ -5237,7 +5304,7 @@
       <w:pPr>
         <w:numPr>
           <w:ilvl w:val="0"/>
-          <w:numId w:val="4"/>
+          <w:numId w:val="6"/>
         </w:numPr>
         <w:spacing w:after="0" w:afterAutospacing="0"/>
         <w:ind w:left="720" w:hanging="360"/>
@@ -5262,7 +5329,7 @@
       <w:pPr>
         <w:numPr>
           <w:ilvl w:val="0"/>
-          <w:numId w:val="4"/>
+          <w:numId w:val="6"/>
         </w:numPr>
         <w:ind w:left="720" w:hanging="360"/>
         <w:jc w:val="both"/>
@@ -5320,7 +5387,7 @@
       <w:pPr>
         <w:numPr>
           <w:ilvl w:val="0"/>
-          <w:numId w:val="3"/>
+          <w:numId w:val="5"/>
         </w:numPr>
         <w:spacing w:after="0" w:afterAutospacing="0"/>
         <w:ind w:left="720" w:hanging="360"/>
@@ -5345,7 +5412,7 @@
       <w:pPr>
         <w:numPr>
           <w:ilvl w:val="0"/>
-          <w:numId w:val="3"/>
+          <w:numId w:val="5"/>
         </w:numPr>
         <w:spacing w:after="0" w:afterAutospacing="0"/>
         <w:ind w:left="720" w:hanging="360"/>
@@ -5370,7 +5437,7 @@
       <w:pPr>
         <w:numPr>
           <w:ilvl w:val="0"/>
-          <w:numId w:val="3"/>
+          <w:numId w:val="5"/>
         </w:numPr>
         <w:ind w:left="720" w:hanging="360"/>
         <w:jc w:val="both"/>
@@ -5523,7 +5590,7 @@
     <w:sdt>
       <w:sdtPr>
         <w:lock w:val="contentLocked"/>
-        <w:id w:val="646365963"/>
+        <w:id w:val="1488828506"/>
         <w:tag w:val="goog_rdk_3"/>
       </w:sdtPr>
       <w:sdtContent>
@@ -6528,7 +6595,7 @@
     <w:sdt>
       <w:sdtPr>
         <w:lock w:val="contentLocked"/>
-        <w:id w:val="2026026574"/>
+        <w:id w:val="-1060968152"/>
         <w:tag w:val="goog_rdk_4"/>
       </w:sdtPr>
       <w:sdtContent>
@@ -7931,7 +7998,7 @@
       <w:pPr>
         <w:numPr>
           <w:ilvl w:val="0"/>
-          <w:numId w:val="1"/>
+          <w:numId w:val="2"/>
         </w:numPr>
         <w:spacing w:after="0" w:afterAutospacing="0"/>
         <w:ind w:left="720" w:hanging="360"/>
@@ -7956,7 +8023,7 @@
       <w:pPr>
         <w:numPr>
           <w:ilvl w:val="0"/>
-          <w:numId w:val="1"/>
+          <w:numId w:val="2"/>
         </w:numPr>
         <w:spacing w:after="0" w:afterAutospacing="0"/>
         <w:ind w:left="720" w:hanging="360"/>
@@ -7981,7 +8048,7 @@
       <w:pPr>
         <w:numPr>
           <w:ilvl w:val="0"/>
-          <w:numId w:val="1"/>
+          <w:numId w:val="2"/>
         </w:numPr>
         <w:spacing w:after="0" w:afterAutospacing="0"/>
         <w:ind w:left="720" w:hanging="360"/>
@@ -8006,7 +8073,7 @@
       <w:pPr>
         <w:numPr>
           <w:ilvl w:val="0"/>
-          <w:numId w:val="1"/>
+          <w:numId w:val="2"/>
         </w:numPr>
         <w:spacing w:after="0" w:afterAutospacing="0"/>
         <w:ind w:left="720" w:hanging="360"/>
@@ -8031,7 +8098,7 @@
       <w:pPr>
         <w:numPr>
           <w:ilvl w:val="0"/>
-          <w:numId w:val="1"/>
+          <w:numId w:val="2"/>
         </w:numPr>
         <w:ind w:left="720" w:hanging="360"/>
         <w:jc w:val="both"/>
@@ -8118,7 +8185,7 @@
     <w:sdt>
       <w:sdtPr>
         <w:lock w:val="contentLocked"/>
-        <w:id w:val="-516586905"/>
+        <w:id w:val="-1873977249"/>
         <w:tag w:val="goog_rdk_5"/>
       </w:sdtPr>
       <w:sdtContent>
@@ -8879,8 +8946,49 @@
     </w:p>
     <w:p>
       <w:pPr>
+        <w:ind w:left="0" w:firstLine="0"/>
+        <w:jc w:val="both"/>
+        <w:rPr>
+          <w:rFonts w:ascii="Times New Roman" w:cs="Times New Roman" w:eastAsia="Times New Roman" w:hAnsi="Times New Roman"/>
+          <w:sz w:val="24"/>
+          <w:szCs w:val="24"/>
+        </w:rPr>
+      </w:pPr>
+      <w:r>
+        <w:rPr>
+          <w:rtl w:val="0"/>
+        </w:rPr>
+      </w:r>
+    </w:p>
+    <w:p>
+      <w:pPr>
+        <w:ind w:left="0" w:firstLine="0"/>
+        <w:jc w:val="both"/>
+        <w:rPr>
+          <w:rFonts w:ascii="Times New Roman" w:cs="Times New Roman" w:eastAsia="Times New Roman" w:hAnsi="Times New Roman"/>
+          <w:sz w:val="24"/>
+          <w:szCs w:val="24"/>
+        </w:rPr>
+      </w:pPr>
+      <w:r>
+        <w:rPr>
+          <w:rtl w:val="0"/>
+        </w:rPr>
+      </w:r>
+    </w:p>
+    <w:p>
+      <w:pPr>
         <w:pStyle w:val="Heading1"/>
         <w:jc w:val="both"/>
+        <w:rPr>
+          <w:rFonts w:ascii="Times New Roman" w:cs="Times New Roman" w:eastAsia="Times New Roman" w:hAnsi="Times New Roman"/>
+          <w:sz w:val="24"/>
+          <w:szCs w:val="24"/>
+        </w:rPr>
+      </w:pPr>
+      <w:bookmarkStart w:colFirst="0" w:colLast="0" w:name="_heading=h.6d1eogamqanj" w:id="14"/>
+      <w:bookmarkEnd w:id="14"/>
+      <w:r>
         <w:rPr>
           <w:rFonts w:ascii="Times New Roman" w:cs="Times New Roman" w:eastAsia="Times New Roman" w:hAnsi="Times New Roman"/>
           <w:b w:val="1"/>
@@ -8888,10 +8996,10 @@
           <w:color w:val="000000"/>
           <w:sz w:val="24"/>
           <w:szCs w:val="24"/>
-        </w:rPr>
-      </w:pPr>
-      <w:bookmarkStart w:colFirst="0" w:colLast="0" w:name="_heading=h.73p9psqakasw" w:id="14"/>
-      <w:bookmarkEnd w:id="14"/>
+          <w:rtl w:val="0"/>
+        </w:rPr>
+        <w:t xml:space="preserve">7</w:t>
+      </w:r>
       <w:r>
         <w:rPr>
           <w:rFonts w:ascii="Times New Roman" w:cs="Times New Roman" w:eastAsia="Times New Roman" w:hAnsi="Times New Roman"/>
@@ -8902,7 +9010,707 @@
           <w:szCs w:val="24"/>
           <w:rtl w:val="0"/>
         </w:rPr>
-        <w:t xml:space="preserve">7. Cronograma</w:t>
+        <w:t xml:space="preserve">. Presupuesto</w:t>
+      </w:r>
+      <w:r>
+        <w:rPr>
+          <w:rtl w:val="0"/>
+        </w:rPr>
+      </w:r>
+    </w:p>
+    <w:p>
+      <w:pPr>
+        <w:spacing w:after="0" w:line="360" w:lineRule="auto"/>
+        <w:jc w:val="both"/>
+        <w:rPr>
+          <w:rFonts w:ascii="Times New Roman" w:cs="Times New Roman" w:eastAsia="Times New Roman" w:hAnsi="Times New Roman"/>
+          <w:sz w:val="24"/>
+          <w:szCs w:val="24"/>
+        </w:rPr>
+      </w:pPr>
+      <w:r>
+        <w:rPr>
+          <w:rFonts w:ascii="Times New Roman" w:cs="Times New Roman" w:eastAsia="Times New Roman" w:hAnsi="Times New Roman"/>
+          <w:sz w:val="24"/>
+          <w:szCs w:val="24"/>
+          <w:rtl w:val="0"/>
+        </w:rPr>
+        <w:t xml:space="preserve">Resumen consolidado de la inversión inicial requerida para el Sistema de Buscador Unificado.</w:t>
+      </w:r>
+    </w:p>
+    <w:p>
+      <w:pPr>
+        <w:spacing w:after="0" w:line="360" w:lineRule="auto"/>
+        <w:jc w:val="both"/>
+        <w:rPr>
+          <w:rFonts w:ascii="Times New Roman" w:cs="Times New Roman" w:eastAsia="Times New Roman" w:hAnsi="Times New Roman"/>
+          <w:sz w:val="24"/>
+          <w:szCs w:val="24"/>
+        </w:rPr>
+      </w:pPr>
+      <w:r>
+        <w:rPr>
+          <w:rtl w:val="0"/>
+        </w:rPr>
+      </w:r>
+    </w:p>
+    <w:sdt>
+      <w:sdtPr>
+        <w:lock w:val="contentLocked"/>
+        <w:id w:val="-2046219338"/>
+        <w:tag w:val="goog_rdk_6"/>
+      </w:sdtPr>
+      <w:sdtContent>
+        <w:tbl>
+          <w:tblPr>
+            <w:tblStyle w:val="Table8"/>
+            <w:tblpPr w:leftFromText="180" w:rightFromText="180" w:topFromText="180" w:bottomFromText="180" w:vertAnchor="text" w:horzAnchor="text" w:tblpX="0" w:tblpY="0"/>
+            <w:tblW w:w="7305.0" w:type="dxa"/>
+            <w:jc w:val="left"/>
+            <w:tblBorders>
+              <w:top w:color="000000" w:space="0" w:sz="0" w:val="nil"/>
+              <w:left w:color="000000" w:space="0" w:sz="0" w:val="nil"/>
+              <w:bottom w:color="000000" w:space="0" w:sz="0" w:val="nil"/>
+              <w:right w:color="000000" w:space="0" w:sz="0" w:val="nil"/>
+              <w:insideH w:color="000000" w:space="0" w:sz="0" w:val="nil"/>
+              <w:insideV w:color="000000" w:space="0" w:sz="0" w:val="nil"/>
+            </w:tblBorders>
+            <w:tblLayout w:type="fixed"/>
+            <w:tblLook w:val="0600"/>
+          </w:tblPr>
+          <w:tblGrid>
+            <w:gridCol w:w="5880"/>
+            <w:gridCol w:w="1425"/>
+            <w:tblGridChange w:id="0">
+              <w:tblGrid>
+                <w:gridCol w:w="5880"/>
+                <w:gridCol w:w="1425"/>
+              </w:tblGrid>
+            </w:tblGridChange>
+          </w:tblGrid>
+          <w:tr>
+            <w:trPr>
+              <w:cantSplit w:val="0"/>
+              <w:trHeight w:val="285" w:hRule="atLeast"/>
+              <w:tblHeader w:val="0"/>
+            </w:trPr>
+            <w:tc>
+              <w:tcPr>
+                <w:tcBorders>
+                  <w:top w:color="000000" w:space="0" w:sz="6" w:val="single"/>
+                  <w:left w:color="000000" w:space="0" w:sz="6" w:val="single"/>
+                  <w:bottom w:color="000000" w:space="0" w:sz="6" w:val="single"/>
+                  <w:right w:color="000000" w:space="0" w:sz="6" w:val="single"/>
+                </w:tcBorders>
+                <w:tcMar>
+                  <w:top w:w="0.0" w:type="dxa"/>
+                  <w:bottom w:w="0.0" w:type="dxa"/>
+                </w:tcMar>
+              </w:tcPr>
+              <w:p>
+                <w:pPr>
+                  <w:spacing w:after="0" w:before="240" w:line="276" w:lineRule="auto"/>
+                  <w:jc w:val="both"/>
+                  <w:rPr>
+                    <w:rFonts w:ascii="Times New Roman" w:cs="Times New Roman" w:eastAsia="Times New Roman" w:hAnsi="Times New Roman"/>
+                    <w:b w:val="1"/>
+                    <w:bCs w:val="1"/>
+                    <w:color w:val="1f1f1f"/>
+                    <w:sz w:val="24"/>
+                    <w:szCs w:val="24"/>
+                  </w:rPr>
+                </w:pPr>
+                <w:r>
+                  <w:rPr>
+                    <w:rFonts w:ascii="Times New Roman" w:cs="Times New Roman" w:eastAsia="Times New Roman" w:hAnsi="Times New Roman"/>
+                    <w:b w:val="1"/>
+                    <w:bCs w:val="1"/>
+                    <w:color w:val="1f1f1f"/>
+                    <w:sz w:val="24"/>
+                    <w:szCs w:val="24"/>
+                    <w:rtl w:val="0"/>
+                  </w:rPr>
+                  <w:t xml:space="preserve">Categoría</w:t>
+                </w:r>
+              </w:p>
+            </w:tc>
+            <w:tc>
+              <w:tcPr>
+                <w:tcBorders>
+                  <w:top w:color="000000" w:space="0" w:sz="6" w:val="single"/>
+                  <w:left w:color="000000" w:space="0" w:sz="6" w:val="single"/>
+                  <w:bottom w:color="000000" w:space="0" w:sz="6" w:val="single"/>
+                  <w:right w:color="000000" w:space="0" w:sz="6" w:val="single"/>
+                </w:tcBorders>
+                <w:tcMar>
+                  <w:top w:w="0.0" w:type="dxa"/>
+                  <w:bottom w:w="0.0" w:type="dxa"/>
+                </w:tcMar>
+              </w:tcPr>
+              <w:p>
+                <w:pPr>
+                  <w:spacing w:after="0" w:before="240" w:line="276" w:lineRule="auto"/>
+                  <w:jc w:val="both"/>
+                  <w:rPr>
+                    <w:rFonts w:ascii="Times New Roman" w:cs="Times New Roman" w:eastAsia="Times New Roman" w:hAnsi="Times New Roman"/>
+                    <w:b w:val="1"/>
+                    <w:bCs w:val="1"/>
+                    <w:color w:val="1f1f1f"/>
+                    <w:sz w:val="24"/>
+                    <w:szCs w:val="24"/>
+                  </w:rPr>
+                </w:pPr>
+                <w:r>
+                  <w:rPr>
+                    <w:rFonts w:ascii="Times New Roman" w:cs="Times New Roman" w:eastAsia="Times New Roman" w:hAnsi="Times New Roman"/>
+                    <w:b w:val="1"/>
+                    <w:bCs w:val="1"/>
+                    <w:color w:val="1f1f1f"/>
+                    <w:sz w:val="24"/>
+                    <w:szCs w:val="24"/>
+                    <w:rtl w:val="0"/>
+                  </w:rPr>
+                  <w:t xml:space="preserve">Costo (S/.)</w:t>
+                </w:r>
+              </w:p>
+            </w:tc>
+          </w:tr>
+          <w:tr>
+            <w:trPr>
+              <w:cantSplit w:val="0"/>
+              <w:trHeight w:val="285" w:hRule="atLeast"/>
+              <w:tblHeader w:val="0"/>
+            </w:trPr>
+            <w:tc>
+              <w:tcPr>
+                <w:tcBorders>
+                  <w:top w:color="000000" w:space="0" w:sz="6" w:val="single"/>
+                  <w:left w:color="000000" w:space="0" w:sz="6" w:val="single"/>
+                  <w:bottom w:color="000000" w:space="0" w:sz="6" w:val="single"/>
+                  <w:right w:color="000000" w:space="0" w:sz="6" w:val="single"/>
+                </w:tcBorders>
+                <w:tcMar>
+                  <w:top w:w="0.0" w:type="dxa"/>
+                  <w:bottom w:w="0.0" w:type="dxa"/>
+                </w:tcMar>
+              </w:tcPr>
+              <w:p>
+                <w:pPr>
+                  <w:spacing w:after="0" w:before="240" w:line="276" w:lineRule="auto"/>
+                  <w:jc w:val="both"/>
+                  <w:rPr>
+                    <w:rFonts w:ascii="Times New Roman" w:cs="Times New Roman" w:eastAsia="Times New Roman" w:hAnsi="Times New Roman"/>
+                    <w:color w:val="1f1f1f"/>
+                    <w:sz w:val="24"/>
+                    <w:szCs w:val="24"/>
+                  </w:rPr>
+                </w:pPr>
+                <w:r>
+                  <w:rPr>
+                    <w:rFonts w:ascii="Times New Roman" w:cs="Times New Roman" w:eastAsia="Times New Roman" w:hAnsi="Times New Roman"/>
+                    <w:color w:val="1f1f1f"/>
+                    <w:sz w:val="24"/>
+                    <w:szCs w:val="24"/>
+                    <w:rtl w:val="0"/>
+                  </w:rPr>
+                  <w:t xml:space="preserve">Costos de Software</w:t>
+                </w:r>
+              </w:p>
+            </w:tc>
+            <w:tc>
+              <w:tcPr>
+                <w:tcBorders>
+                  <w:top w:color="000000" w:space="0" w:sz="6" w:val="single"/>
+                  <w:left w:color="000000" w:space="0" w:sz="6" w:val="single"/>
+                  <w:bottom w:color="000000" w:space="0" w:sz="6" w:val="single"/>
+                  <w:right w:color="000000" w:space="0" w:sz="6" w:val="single"/>
+                </w:tcBorders>
+                <w:tcMar>
+                  <w:top w:w="0.0" w:type="dxa"/>
+                  <w:bottom w:w="0.0" w:type="dxa"/>
+                </w:tcMar>
+              </w:tcPr>
+              <w:p>
+                <w:pPr>
+                  <w:spacing w:after="0" w:before="240" w:line="276" w:lineRule="auto"/>
+                  <w:jc w:val="both"/>
+                  <w:rPr>
+                    <w:rFonts w:ascii="Times New Roman" w:cs="Times New Roman" w:eastAsia="Times New Roman" w:hAnsi="Times New Roman"/>
+                    <w:color w:val="1f1f1f"/>
+                    <w:sz w:val="24"/>
+                    <w:szCs w:val="24"/>
+                  </w:rPr>
+                </w:pPr>
+                <w:r>
+                  <w:rPr>
+                    <w:rFonts w:ascii="Times New Roman" w:cs="Times New Roman" w:eastAsia="Times New Roman" w:hAnsi="Times New Roman"/>
+                    <w:color w:val="1f1f1f"/>
+                    <w:sz w:val="24"/>
+                    <w:szCs w:val="24"/>
+                    <w:rtl w:val="0"/>
+                  </w:rPr>
+                  <w:t xml:space="preserve">1,320</w:t>
+                </w:r>
+              </w:p>
+            </w:tc>
+          </w:tr>
+          <w:tr>
+            <w:trPr>
+              <w:cantSplit w:val="0"/>
+              <w:trHeight w:val="285" w:hRule="atLeast"/>
+              <w:tblHeader w:val="0"/>
+            </w:trPr>
+            <w:tc>
+              <w:tcPr>
+                <w:tcBorders>
+                  <w:top w:color="000000" w:space="0" w:sz="6" w:val="single"/>
+                  <w:left w:color="000000" w:space="0" w:sz="6" w:val="single"/>
+                  <w:bottom w:color="000000" w:space="0" w:sz="6" w:val="single"/>
+                  <w:right w:color="000000" w:space="0" w:sz="6" w:val="single"/>
+                </w:tcBorders>
+                <w:tcMar>
+                  <w:top w:w="0.0" w:type="dxa"/>
+                  <w:bottom w:w="0.0" w:type="dxa"/>
+                </w:tcMar>
+              </w:tcPr>
+              <w:p>
+                <w:pPr>
+                  <w:spacing w:after="0" w:before="240" w:line="276" w:lineRule="auto"/>
+                  <w:jc w:val="both"/>
+                  <w:rPr>
+                    <w:rFonts w:ascii="Times New Roman" w:cs="Times New Roman" w:eastAsia="Times New Roman" w:hAnsi="Times New Roman"/>
+                    <w:color w:val="1f1f1f"/>
+                    <w:sz w:val="24"/>
+                    <w:szCs w:val="24"/>
+                  </w:rPr>
+                </w:pPr>
+                <w:r>
+                  <w:rPr>
+                    <w:rFonts w:ascii="Times New Roman" w:cs="Times New Roman" w:eastAsia="Times New Roman" w:hAnsi="Times New Roman"/>
+                    <w:color w:val="1f1f1f"/>
+                    <w:sz w:val="24"/>
+                    <w:szCs w:val="24"/>
+                    <w:rtl w:val="0"/>
+                  </w:rPr>
+                  <w:t xml:space="preserve">Costos de Recursos Humanos</w:t>
+                </w:r>
+              </w:p>
+            </w:tc>
+            <w:tc>
+              <w:tcPr>
+                <w:tcBorders>
+                  <w:top w:color="000000" w:space="0" w:sz="6" w:val="single"/>
+                  <w:left w:color="000000" w:space="0" w:sz="6" w:val="single"/>
+                  <w:bottom w:color="000000" w:space="0" w:sz="6" w:val="single"/>
+                  <w:right w:color="000000" w:space="0" w:sz="6" w:val="single"/>
+                </w:tcBorders>
+                <w:tcMar>
+                  <w:top w:w="0.0" w:type="dxa"/>
+                  <w:bottom w:w="0.0" w:type="dxa"/>
+                </w:tcMar>
+              </w:tcPr>
+              <w:p>
+                <w:pPr>
+                  <w:spacing w:after="0" w:before="240" w:line="276" w:lineRule="auto"/>
+                  <w:jc w:val="both"/>
+                  <w:rPr>
+                    <w:rFonts w:ascii="Times New Roman" w:cs="Times New Roman" w:eastAsia="Times New Roman" w:hAnsi="Times New Roman"/>
+                    <w:color w:val="1f1f1f"/>
+                    <w:sz w:val="24"/>
+                    <w:szCs w:val="24"/>
+                  </w:rPr>
+                </w:pPr>
+                <w:r>
+                  <w:rPr>
+                    <w:rFonts w:ascii="Times New Roman" w:cs="Times New Roman" w:eastAsia="Times New Roman" w:hAnsi="Times New Roman"/>
+                    <w:color w:val="1f1f1f"/>
+                    <w:sz w:val="24"/>
+                    <w:szCs w:val="24"/>
+                    <w:rtl w:val="0"/>
+                  </w:rPr>
+                  <w:t xml:space="preserve">7,500</w:t>
+                </w:r>
+              </w:p>
+            </w:tc>
+          </w:tr>
+          <w:tr>
+            <w:trPr>
+              <w:cantSplit w:val="0"/>
+              <w:trHeight w:val="285" w:hRule="atLeast"/>
+              <w:tblHeader w:val="0"/>
+            </w:trPr>
+            <w:tc>
+              <w:tcPr>
+                <w:tcBorders>
+                  <w:top w:color="000000" w:space="0" w:sz="6" w:val="single"/>
+                  <w:left w:color="000000" w:space="0" w:sz="6" w:val="single"/>
+                  <w:bottom w:color="000000" w:space="0" w:sz="6" w:val="single"/>
+                  <w:right w:color="000000" w:space="0" w:sz="6" w:val="single"/>
+                </w:tcBorders>
+                <w:tcMar>
+                  <w:top w:w="0.0" w:type="dxa"/>
+                  <w:bottom w:w="0.0" w:type="dxa"/>
+                </w:tcMar>
+              </w:tcPr>
+              <w:p>
+                <w:pPr>
+                  <w:spacing w:after="0" w:before="240" w:line="276" w:lineRule="auto"/>
+                  <w:jc w:val="both"/>
+                  <w:rPr>
+                    <w:rFonts w:ascii="Times New Roman" w:cs="Times New Roman" w:eastAsia="Times New Roman" w:hAnsi="Times New Roman"/>
+                    <w:color w:val="1f1f1f"/>
+                    <w:sz w:val="24"/>
+                    <w:szCs w:val="24"/>
+                  </w:rPr>
+                </w:pPr>
+                <w:r>
+                  <w:rPr>
+                    <w:rFonts w:ascii="Times New Roman" w:cs="Times New Roman" w:eastAsia="Times New Roman" w:hAnsi="Times New Roman"/>
+                    <w:color w:val="1f1f1f"/>
+                    <w:sz w:val="24"/>
+                    <w:szCs w:val="24"/>
+                    <w:rtl w:val="0"/>
+                  </w:rPr>
+                  <w:t xml:space="preserve">Costos Generales de Administración</w:t>
+                </w:r>
+              </w:p>
+            </w:tc>
+            <w:tc>
+              <w:tcPr>
+                <w:tcBorders>
+                  <w:top w:color="000000" w:space="0" w:sz="6" w:val="single"/>
+                  <w:left w:color="000000" w:space="0" w:sz="6" w:val="single"/>
+                  <w:bottom w:color="000000" w:space="0" w:sz="6" w:val="single"/>
+                  <w:right w:color="000000" w:space="0" w:sz="6" w:val="single"/>
+                </w:tcBorders>
+                <w:tcMar>
+                  <w:top w:w="0.0" w:type="dxa"/>
+                  <w:bottom w:w="0.0" w:type="dxa"/>
+                </w:tcMar>
+              </w:tcPr>
+              <w:p>
+                <w:pPr>
+                  <w:spacing w:after="0" w:before="240" w:line="276" w:lineRule="auto"/>
+                  <w:jc w:val="both"/>
+                  <w:rPr>
+                    <w:rFonts w:ascii="Times New Roman" w:cs="Times New Roman" w:eastAsia="Times New Roman" w:hAnsi="Times New Roman"/>
+                    <w:color w:val="1f1f1f"/>
+                    <w:sz w:val="24"/>
+                    <w:szCs w:val="24"/>
+                  </w:rPr>
+                </w:pPr>
+                <w:r>
+                  <w:rPr>
+                    <w:rFonts w:ascii="Times New Roman" w:cs="Times New Roman" w:eastAsia="Times New Roman" w:hAnsi="Times New Roman"/>
+                    <w:color w:val="1f1f1f"/>
+                    <w:sz w:val="24"/>
+                    <w:szCs w:val="24"/>
+                    <w:rtl w:val="0"/>
+                  </w:rPr>
+                  <w:t xml:space="preserve">720</w:t>
+                </w:r>
+              </w:p>
+            </w:tc>
+          </w:tr>
+          <w:tr>
+            <w:trPr>
+              <w:cantSplit w:val="0"/>
+              <w:trHeight w:val="285" w:hRule="atLeast"/>
+              <w:tblHeader w:val="0"/>
+            </w:trPr>
+            <w:tc>
+              <w:tcPr>
+                <w:tcBorders>
+                  <w:top w:color="000000" w:space="0" w:sz="6" w:val="single"/>
+                  <w:left w:color="000000" w:space="0" w:sz="6" w:val="single"/>
+                  <w:bottom w:color="000000" w:space="0" w:sz="6" w:val="single"/>
+                  <w:right w:color="000000" w:space="0" w:sz="6" w:val="single"/>
+                </w:tcBorders>
+                <w:tcMar>
+                  <w:top w:w="0.0" w:type="dxa"/>
+                  <w:bottom w:w="0.0" w:type="dxa"/>
+                </w:tcMar>
+              </w:tcPr>
+              <w:p>
+                <w:pPr>
+                  <w:spacing w:after="0" w:before="240" w:line="276" w:lineRule="auto"/>
+                  <w:jc w:val="both"/>
+                  <w:rPr>
+                    <w:rFonts w:ascii="Times New Roman" w:cs="Times New Roman" w:eastAsia="Times New Roman" w:hAnsi="Times New Roman"/>
+                    <w:b w:val="1"/>
+                    <w:bCs w:val="1"/>
+                    <w:color w:val="1f1f1f"/>
+                    <w:sz w:val="24"/>
+                    <w:szCs w:val="24"/>
+                  </w:rPr>
+                </w:pPr>
+                <w:r>
+                  <w:rPr>
+                    <w:rFonts w:ascii="Times New Roman" w:cs="Times New Roman" w:eastAsia="Times New Roman" w:hAnsi="Times New Roman"/>
+                    <w:b w:val="1"/>
+                    <w:bCs w:val="1"/>
+                    <w:color w:val="1f1f1f"/>
+                    <w:sz w:val="24"/>
+                    <w:szCs w:val="24"/>
+                    <w:rtl w:val="0"/>
+                  </w:rPr>
+                  <w:t xml:space="preserve">Costo Total del Proyecto</w:t>
+                </w:r>
+              </w:p>
+            </w:tc>
+            <w:tc>
+              <w:tcPr>
+                <w:tcBorders>
+                  <w:top w:color="000000" w:space="0" w:sz="6" w:val="single"/>
+                  <w:left w:color="000000" w:space="0" w:sz="6" w:val="single"/>
+                  <w:bottom w:color="000000" w:space="0" w:sz="6" w:val="single"/>
+                  <w:right w:color="000000" w:space="0" w:sz="6" w:val="single"/>
+                </w:tcBorders>
+                <w:tcMar>
+                  <w:top w:w="0.0" w:type="dxa"/>
+                  <w:bottom w:w="0.0" w:type="dxa"/>
+                </w:tcMar>
+              </w:tcPr>
+              <w:p>
+                <w:pPr>
+                  <w:spacing w:after="0" w:before="240" w:line="276" w:lineRule="auto"/>
+                  <w:jc w:val="both"/>
+                  <w:rPr>
+                    <w:rFonts w:ascii="Times New Roman" w:cs="Times New Roman" w:eastAsia="Times New Roman" w:hAnsi="Times New Roman"/>
+                    <w:b w:val="1"/>
+                    <w:bCs w:val="1"/>
+                    <w:color w:val="1f1f1f"/>
+                    <w:sz w:val="24"/>
+                    <w:szCs w:val="24"/>
+                  </w:rPr>
+                </w:pPr>
+                <w:r>
+                  <w:rPr>
+                    <w:rFonts w:ascii="Times New Roman" w:cs="Times New Roman" w:eastAsia="Times New Roman" w:hAnsi="Times New Roman"/>
+                    <w:b w:val="1"/>
+                    <w:bCs w:val="1"/>
+                    <w:color w:val="1f1f1f"/>
+                    <w:sz w:val="24"/>
+                    <w:szCs w:val="24"/>
+                    <w:rtl w:val="0"/>
+                  </w:rPr>
+                  <w:t xml:space="preserve">9,540</w:t>
+                </w:r>
+              </w:p>
+            </w:tc>
+          </w:tr>
+        </w:tbl>
+      </w:sdtContent>
+    </w:sdt>
+    <w:p>
+      <w:pPr>
+        <w:pStyle w:val="Heading2"/>
+        <w:spacing w:after="0" w:before="0" w:line="360" w:lineRule="auto"/>
+        <w:jc w:val="both"/>
+        <w:rPr>
+          <w:rFonts w:ascii="Times New Roman" w:cs="Times New Roman" w:eastAsia="Times New Roman" w:hAnsi="Times New Roman"/>
+          <w:sz w:val="24"/>
+          <w:szCs w:val="24"/>
+        </w:rPr>
+      </w:pPr>
+      <w:bookmarkStart w:colFirst="0" w:colLast="0" w:name="_heading=h.yqu811yyd3b9" w:id="15"/>
+      <w:bookmarkEnd w:id="15"/>
+      <w:r>
+        <w:rPr>
+          <w:rtl w:val="0"/>
+        </w:rPr>
+      </w:r>
+    </w:p>
+    <w:p>
+      <w:pPr>
+        <w:ind w:left="0" w:firstLine="0"/>
+        <w:jc w:val="both"/>
+        <w:rPr>
+          <w:rFonts w:ascii="Times New Roman" w:cs="Times New Roman" w:eastAsia="Times New Roman" w:hAnsi="Times New Roman"/>
+          <w:sz w:val="24"/>
+          <w:szCs w:val="24"/>
+        </w:rPr>
+      </w:pPr>
+      <w:r>
+        <w:rPr>
+          <w:rtl w:val="0"/>
+        </w:rPr>
+      </w:r>
+    </w:p>
+    <w:p>
+      <w:pPr>
+        <w:ind w:left="0" w:firstLine="0"/>
+        <w:jc w:val="both"/>
+        <w:rPr>
+          <w:rFonts w:ascii="Times New Roman" w:cs="Times New Roman" w:eastAsia="Times New Roman" w:hAnsi="Times New Roman"/>
+          <w:sz w:val="24"/>
+          <w:szCs w:val="24"/>
+        </w:rPr>
+      </w:pPr>
+      <w:r>
+        <w:rPr>
+          <w:rtl w:val="0"/>
+        </w:rPr>
+      </w:r>
+    </w:p>
+    <w:p>
+      <w:pPr>
+        <w:ind w:left="0" w:firstLine="0"/>
+        <w:jc w:val="both"/>
+        <w:rPr>
+          <w:rFonts w:ascii="Times New Roman" w:cs="Times New Roman" w:eastAsia="Times New Roman" w:hAnsi="Times New Roman"/>
+          <w:sz w:val="24"/>
+          <w:szCs w:val="24"/>
+        </w:rPr>
+      </w:pPr>
+      <w:r>
+        <w:rPr>
+          <w:rtl w:val="0"/>
+        </w:rPr>
+      </w:r>
+    </w:p>
+    <w:p>
+      <w:pPr>
+        <w:ind w:left="0" w:firstLine="0"/>
+        <w:jc w:val="both"/>
+        <w:rPr>
+          <w:rFonts w:ascii="Times New Roman" w:cs="Times New Roman" w:eastAsia="Times New Roman" w:hAnsi="Times New Roman"/>
+          <w:sz w:val="24"/>
+          <w:szCs w:val="24"/>
+        </w:rPr>
+      </w:pPr>
+      <w:r>
+        <w:rPr>
+          <w:rtl w:val="0"/>
+        </w:rPr>
+      </w:r>
+    </w:p>
+    <w:p>
+      <w:pPr>
+        <w:ind w:left="0" w:firstLine="0"/>
+        <w:jc w:val="both"/>
+        <w:rPr>
+          <w:rFonts w:ascii="Times New Roman" w:cs="Times New Roman" w:eastAsia="Times New Roman" w:hAnsi="Times New Roman"/>
+          <w:sz w:val="24"/>
+          <w:szCs w:val="24"/>
+        </w:rPr>
+      </w:pPr>
+      <w:r>
+        <w:rPr>
+          <w:rtl w:val="0"/>
+        </w:rPr>
+      </w:r>
+    </w:p>
+    <w:p>
+      <w:pPr>
+        <w:ind w:left="0" w:firstLine="0"/>
+        <w:jc w:val="both"/>
+        <w:rPr>
+          <w:rFonts w:ascii="Times New Roman" w:cs="Times New Roman" w:eastAsia="Times New Roman" w:hAnsi="Times New Roman"/>
+          <w:sz w:val="24"/>
+          <w:szCs w:val="24"/>
+        </w:rPr>
+      </w:pPr>
+      <w:r>
+        <w:rPr>
+          <w:rtl w:val="0"/>
+        </w:rPr>
+      </w:r>
+    </w:p>
+    <w:p>
+      <w:pPr>
+        <w:ind w:left="0" w:firstLine="0"/>
+        <w:jc w:val="both"/>
+        <w:rPr>
+          <w:rFonts w:ascii="Times New Roman" w:cs="Times New Roman" w:eastAsia="Times New Roman" w:hAnsi="Times New Roman"/>
+          <w:sz w:val="24"/>
+          <w:szCs w:val="24"/>
+        </w:rPr>
+      </w:pPr>
+      <w:r>
+        <w:rPr>
+          <w:rtl w:val="0"/>
+        </w:rPr>
+      </w:r>
+    </w:p>
+    <w:p>
+      <w:pPr>
+        <w:ind w:left="0" w:firstLine="0"/>
+        <w:jc w:val="both"/>
+        <w:rPr>
+          <w:rFonts w:ascii="Times New Roman" w:cs="Times New Roman" w:eastAsia="Times New Roman" w:hAnsi="Times New Roman"/>
+          <w:sz w:val="24"/>
+          <w:szCs w:val="24"/>
+        </w:rPr>
+      </w:pPr>
+      <w:r>
+        <w:rPr>
+          <w:rtl w:val="0"/>
+        </w:rPr>
+      </w:r>
+    </w:p>
+    <w:p>
+      <w:pPr>
+        <w:ind w:left="0" w:firstLine="0"/>
+        <w:jc w:val="both"/>
+        <w:rPr>
+          <w:rFonts w:ascii="Times New Roman" w:cs="Times New Roman" w:eastAsia="Times New Roman" w:hAnsi="Times New Roman"/>
+          <w:sz w:val="24"/>
+          <w:szCs w:val="24"/>
+        </w:rPr>
+      </w:pPr>
+      <w:r>
+        <w:rPr>
+          <w:rtl w:val="0"/>
+        </w:rPr>
+      </w:r>
+    </w:p>
+    <w:p>
+      <w:pPr>
+        <w:ind w:left="0" w:firstLine="0"/>
+        <w:jc w:val="both"/>
+        <w:rPr>
+          <w:rFonts w:ascii="Times New Roman" w:cs="Times New Roman" w:eastAsia="Times New Roman" w:hAnsi="Times New Roman"/>
+          <w:sz w:val="24"/>
+          <w:szCs w:val="24"/>
+        </w:rPr>
+      </w:pPr>
+      <w:r>
+        <w:rPr>
+          <w:rtl w:val="0"/>
+        </w:rPr>
+      </w:r>
+    </w:p>
+    <w:p>
+      <w:pPr>
+        <w:ind w:left="0" w:firstLine="0"/>
+        <w:jc w:val="both"/>
+        <w:rPr>
+          <w:rFonts w:ascii="Times New Roman" w:cs="Times New Roman" w:eastAsia="Times New Roman" w:hAnsi="Times New Roman"/>
+          <w:sz w:val="24"/>
+          <w:szCs w:val="24"/>
+        </w:rPr>
+      </w:pPr>
+      <w:r>
+        <w:rPr>
+          <w:rtl w:val="0"/>
+        </w:rPr>
+      </w:r>
+    </w:p>
+    <w:p>
+      <w:pPr>
+        <w:ind w:left="0" w:firstLine="0"/>
+        <w:jc w:val="both"/>
+        <w:rPr>
+          <w:rFonts w:ascii="Times New Roman" w:cs="Times New Roman" w:eastAsia="Times New Roman" w:hAnsi="Times New Roman"/>
+          <w:sz w:val="24"/>
+          <w:szCs w:val="24"/>
+        </w:rPr>
+      </w:pPr>
+      <w:r>
+        <w:rPr>
+          <w:rtl w:val="0"/>
+        </w:rPr>
       </w:r>
     </w:p>
     <w:p>
@@ -8934,8 +9742,8 @@
           <w:szCs w:val="24"/>
         </w:rPr>
       </w:pPr>
-      <w:bookmarkStart w:colFirst="0" w:colLast="0" w:name="_heading=h.6d1eogamqanj" w:id="15"/>
-      <w:bookmarkEnd w:id="15"/>
+      <w:bookmarkStart w:colFirst="0" w:colLast="0" w:name="_heading=h.4446u0qmxo2v" w:id="16"/>
+      <w:bookmarkEnd w:id="16"/>
       <w:r>
         <w:rPr>
           <w:rFonts w:ascii="Times New Roman" w:cs="Times New Roman" w:eastAsia="Times New Roman" w:hAnsi="Times New Roman"/>
@@ -8946,29 +9754,9 @@
           <w:szCs w:val="24"/>
           <w:rtl w:val="0"/>
         </w:rPr>
-        <w:t xml:space="preserve">8.  Presupuesto</w:t>
-      </w:r>
-    </w:p>
-    <w:p>
-      <w:pPr>
-        <w:ind w:left="0" w:firstLine="0"/>
-        <w:jc w:val="both"/>
-        <w:rPr>
-          <w:rFonts w:ascii="Times New Roman" w:cs="Times New Roman" w:eastAsia="Times New Roman" w:hAnsi="Times New Roman"/>
-          <w:sz w:val="24"/>
-          <w:szCs w:val="24"/>
-        </w:rPr>
-      </w:pPr>
-      <w:r>
-        <w:rPr>
-          <w:rtl w:val="0"/>
-        </w:rPr>
-      </w:r>
-    </w:p>
-    <w:p>
-      <w:pPr>
-        <w:pStyle w:val="Heading1"/>
-        <w:jc w:val="both"/>
+        <w:t xml:space="preserve">8</w:t>
+      </w:r>
+      <w:r>
         <w:rPr>
           <w:rFonts w:ascii="Times New Roman" w:cs="Times New Roman" w:eastAsia="Times New Roman" w:hAnsi="Times New Roman"/>
           <w:b w:val="1"/>
@@ -8976,10 +9764,213 @@
           <w:color w:val="000000"/>
           <w:sz w:val="24"/>
           <w:szCs w:val="24"/>
-        </w:rPr>
-      </w:pPr>
-      <w:bookmarkStart w:colFirst="0" w:colLast="0" w:name="_heading=h.4446u0qmxo2v" w:id="16"/>
-      <w:bookmarkEnd w:id="16"/>
+          <w:rtl w:val="0"/>
+        </w:rPr>
+        <w:t xml:space="preserve">. Conclusiones y Recomendaciones</w:t>
+      </w:r>
+    </w:p>
+    <w:p>
+      <w:pPr>
+        <w:numPr>
+          <w:ilvl w:val="0"/>
+          <w:numId w:val="4"/>
+        </w:numPr>
+        <w:spacing w:after="0" w:afterAutospacing="0" w:line="276" w:lineRule="auto"/>
+        <w:ind w:left="720" w:hanging="360"/>
+        <w:jc w:val="both"/>
+        <w:rPr>
+          <w:rFonts w:ascii="Times New Roman" w:cs="Times New Roman" w:eastAsia="Times New Roman" w:hAnsi="Times New Roman"/>
+          <w:sz w:val="24"/>
+          <w:szCs w:val="24"/>
+          <w:u w:val="none"/>
+        </w:rPr>
+      </w:pPr>
+      <w:r>
+        <w:rPr>
+          <w:rFonts w:ascii="Times New Roman" w:cs="Times New Roman" w:eastAsia="Times New Roman" w:hAnsi="Times New Roman"/>
+          <w:b w:val="1"/>
+          <w:bCs w:val="1"/>
+          <w:sz w:val="24"/>
+          <w:szCs w:val="24"/>
+          <w:rtl w:val="0"/>
+        </w:rPr>
+        <w:t xml:space="preserve">Optimización de la búsqueda académica:</w:t>
+      </w:r>
+      <w:r>
+        <w:rPr>
+          <w:rFonts w:ascii="Times New Roman" w:cs="Times New Roman" w:eastAsia="Times New Roman" w:hAnsi="Times New Roman"/>
+          <w:sz w:val="24"/>
+          <w:szCs w:val="24"/>
+          <w:rtl w:val="0"/>
+        </w:rPr>
+        <w:t xml:space="preserve"> Se logró centralizar la información bibliográfica mediante el Sistema NexusLib, resolviendo el problema crítico de fragmentación entre inventarios físicos y digitales. Esta unificación permite reducir el tiempo de investigación de los usuarios, eliminando los procesos lentos de consulta en sistemas separados que anteriormente tomaban entre 15 y 20 minutos.</w:t>
+      </w:r>
+    </w:p>
+    <w:p>
+      <w:pPr>
+        <w:numPr>
+          <w:ilvl w:val="0"/>
+          <w:numId w:val="4"/>
+        </w:numPr>
+        <w:spacing w:after="0" w:afterAutospacing="0" w:line="276" w:lineRule="auto"/>
+        <w:ind w:left="720" w:hanging="360"/>
+        <w:jc w:val="both"/>
+        <w:rPr>
+          <w:rFonts w:ascii="Times New Roman" w:cs="Times New Roman" w:eastAsia="Times New Roman" w:hAnsi="Times New Roman"/>
+          <w:sz w:val="24"/>
+          <w:szCs w:val="24"/>
+          <w:u w:val="none"/>
+        </w:rPr>
+      </w:pPr>
+      <w:r>
+        <w:rPr>
+          <w:rFonts w:ascii="Times New Roman" w:cs="Times New Roman" w:eastAsia="Times New Roman" w:hAnsi="Times New Roman"/>
+          <w:b w:val="1"/>
+          <w:bCs w:val="1"/>
+          <w:sz w:val="24"/>
+          <w:szCs w:val="24"/>
+          <w:rtl w:val="0"/>
+        </w:rPr>
+        <w:t xml:space="preserve">Integridad y escalabilidad técnica:</w:t>
+      </w:r>
+      <w:r>
+        <w:rPr>
+          <w:rFonts w:ascii="Times New Roman" w:cs="Times New Roman" w:eastAsia="Times New Roman" w:hAnsi="Times New Roman"/>
+          <w:sz w:val="24"/>
+          <w:szCs w:val="24"/>
+          <w:rtl w:val="0"/>
+        </w:rPr>
+        <w:t xml:space="preserve"> La aplicación de patrones de software estructurales y de comportamiento, específicamente Adapter, Facade y Strategy, garantiza una arquitectura de software modular y desacoplada. Esto permite que la integración entre la Google Books API y la base de datos local MySQL sea eficiente, facilitando el mantenimiento futuro y la adición de nuevas fuentes de metadatos sin comprometer el núcleo del sistema.</w:t>
+      </w:r>
+    </w:p>
+    <w:p>
+      <w:pPr>
+        <w:numPr>
+          <w:ilvl w:val="0"/>
+          <w:numId w:val="4"/>
+        </w:numPr>
+        <w:spacing w:after="0" w:afterAutospacing="0" w:line="276" w:lineRule="auto"/>
+        <w:ind w:left="720" w:hanging="360"/>
+        <w:jc w:val="both"/>
+        <w:rPr>
+          <w:rFonts w:ascii="Times New Roman" w:cs="Times New Roman" w:eastAsia="Times New Roman" w:hAnsi="Times New Roman"/>
+          <w:sz w:val="24"/>
+          <w:szCs w:val="24"/>
+          <w:u w:val="none"/>
+        </w:rPr>
+      </w:pPr>
+      <w:r>
+        <w:rPr>
+          <w:rFonts w:ascii="Times New Roman" w:cs="Times New Roman" w:eastAsia="Times New Roman" w:hAnsi="Times New Roman"/>
+          <w:b w:val="1"/>
+          <w:bCs w:val="1"/>
+          <w:sz w:val="24"/>
+          <w:szCs w:val="24"/>
+          <w:rtl w:val="0"/>
+        </w:rPr>
+        <w:t xml:space="preserve">Viabilidad económica y rentabilidad:</w:t>
+      </w:r>
+      <w:r>
+        <w:rPr>
+          <w:rFonts w:ascii="Times New Roman" w:cs="Times New Roman" w:eastAsia="Times New Roman" w:hAnsi="Times New Roman"/>
+          <w:sz w:val="24"/>
+          <w:szCs w:val="24"/>
+          <w:rtl w:val="0"/>
+        </w:rPr>
+        <w:t xml:space="preserve"> El análisis financiero confirma que el proyecto es plenamente factible y rentable para la institución, presentando un VAN positivo de S/ 4,199.12 y una tasa interna de retorno (TIR) del 17%. Con una relación Beneficio/Costo de 1.44, se asegura que la inversión inicial de S/ 9,540 es recuperable y generará un valor agregado significativo a largo plazo.</w:t>
+      </w:r>
+    </w:p>
+    <w:p>
+      <w:pPr>
+        <w:numPr>
+          <w:ilvl w:val="0"/>
+          <w:numId w:val="4"/>
+        </w:numPr>
+        <w:spacing w:after="0" w:afterAutospacing="0" w:line="276" w:lineRule="auto"/>
+        <w:ind w:left="720" w:hanging="360"/>
+        <w:jc w:val="both"/>
+        <w:rPr>
+          <w:rFonts w:ascii="Times New Roman" w:cs="Times New Roman" w:eastAsia="Times New Roman" w:hAnsi="Times New Roman"/>
+          <w:sz w:val="24"/>
+          <w:szCs w:val="24"/>
+          <w:u w:val="none"/>
+        </w:rPr>
+      </w:pPr>
+      <w:r>
+        <w:rPr>
+          <w:rFonts w:ascii="Times New Roman" w:cs="Times New Roman" w:eastAsia="Times New Roman" w:hAnsi="Times New Roman"/>
+          <w:b w:val="1"/>
+          <w:bCs w:val="1"/>
+          <w:sz w:val="24"/>
+          <w:szCs w:val="24"/>
+          <w:rtl w:val="0"/>
+        </w:rPr>
+        <w:t xml:space="preserve">Cumplimiento de requerimientos y usabilidad:</w:t>
+      </w:r>
+      <w:r>
+        <w:rPr>
+          <w:rFonts w:ascii="Times New Roman" w:cs="Times New Roman" w:eastAsia="Times New Roman" w:hAnsi="Times New Roman"/>
+          <w:sz w:val="24"/>
+          <w:szCs w:val="24"/>
+          <w:rtl w:val="0"/>
+        </w:rPr>
+        <w:t xml:space="preserve"> El sistema cumple con los 6 requerimientos funcionales estratégicos, permitiendo no solo la búsqueda híbrida, sino también la localización física exacta (piso y estante) y el acceso digital directo. Esto, sumado al enfoque de diseño Mobile First, asegura una alta usabilidad y satisfacción para el estudiante e investigador sin requerir capacitación especializada.</w:t>
+      </w:r>
+    </w:p>
+    <w:p>
+      <w:pPr>
+        <w:numPr>
+          <w:ilvl w:val="0"/>
+          <w:numId w:val="4"/>
+        </w:numPr>
+        <w:spacing w:line="276" w:lineRule="auto"/>
+        <w:ind w:left="720" w:hanging="360"/>
+        <w:jc w:val="both"/>
+        <w:rPr>
+          <w:rFonts w:ascii="Times New Roman" w:cs="Times New Roman" w:eastAsia="Times New Roman" w:hAnsi="Times New Roman"/>
+          <w:sz w:val="24"/>
+          <w:szCs w:val="24"/>
+          <w:u w:val="none"/>
+        </w:rPr>
+      </w:pPr>
+      <w:r>
+        <w:rPr>
+          <w:rFonts w:ascii="Times New Roman" w:cs="Times New Roman" w:eastAsia="Times New Roman" w:hAnsi="Times New Roman"/>
+          <w:b w:val="1"/>
+          <w:bCs w:val="1"/>
+          <w:sz w:val="24"/>
+          <w:szCs w:val="24"/>
+          <w:rtl w:val="0"/>
+        </w:rPr>
+        <w:t xml:space="preserve">Eficiencia en la infraestructura cloud:</w:t>
+      </w:r>
+      <w:r>
+        <w:rPr>
+          <w:rFonts w:ascii="Times New Roman" w:cs="Times New Roman" w:eastAsia="Times New Roman" w:hAnsi="Times New Roman"/>
+          <w:sz w:val="24"/>
+          <w:szCs w:val="24"/>
+          <w:rtl w:val="0"/>
+        </w:rPr>
+        <w:t xml:space="preserve"> La configuración de la infraestructura como código (IaC) mediante Terraform para el despliegue en Microsoft Azure garantiza la alta disponibilidad y seguridad del sistema. Esta implementación técnica asegura que NexusLib sea una plataforma robusta, capaz de manejar consultas simultáneas con tiempos de respuesta optimizados.</w:t>
+      </w:r>
+      <w:r>
+        <w:rPr>
+          <w:rtl w:val="0"/>
+        </w:rPr>
+      </w:r>
+    </w:p>
+    <w:p>
+      <w:pPr>
+        <w:pStyle w:val="Heading1"/>
+        <w:jc w:val="both"/>
+        <w:rPr>
+          <w:rFonts w:ascii="Arial" w:cs="Arial" w:eastAsia="Arial" w:hAnsi="Arial"/>
+          <w:sz w:val="24"/>
+          <w:szCs w:val="24"/>
+        </w:rPr>
+      </w:pPr>
+      <w:bookmarkStart w:colFirst="0" w:colLast="0" w:name="_heading=h.r0i4odm0dg04" w:id="17"/>
+      <w:bookmarkEnd w:id="17"/>
       <w:r>
         <w:rPr>
           <w:rFonts w:ascii="Times New Roman" w:cs="Times New Roman" w:eastAsia="Times New Roman" w:hAnsi="Times New Roman"/>
@@ -8990,29 +9981,9 @@
           <w:szCs w:val="24"/>
           <w:rtl w:val="0"/>
         </w:rPr>
-        <w:t xml:space="preserve">9. Conclusiones y Recomendaciones</w:t>
-      </w:r>
-    </w:p>
-    <w:p>
-      <w:pPr>
-        <w:ind w:left="0" w:firstLine="0"/>
-        <w:jc w:val="both"/>
-        <w:rPr>
-          <w:rFonts w:ascii="Times New Roman" w:cs="Times New Roman" w:eastAsia="Times New Roman" w:hAnsi="Times New Roman"/>
-          <w:sz w:val="24"/>
-          <w:szCs w:val="24"/>
-        </w:rPr>
-      </w:pPr>
-      <w:r>
-        <w:rPr>
-          <w:rtl w:val="0"/>
-        </w:rPr>
-      </w:r>
-    </w:p>
-    <w:p>
-      <w:pPr>
-        <w:pStyle w:val="Heading1"/>
-        <w:jc w:val="both"/>
+        <w:t xml:space="preserve">9</w:t>
+      </w:r>
+      <w:r>
         <w:rPr>
           <w:rFonts w:ascii="Times New Roman" w:cs="Times New Roman" w:eastAsia="Times New Roman" w:hAnsi="Times New Roman"/>
           <w:b w:val="1"/>
@@ -9020,11 +9991,261 @@
           <w:color w:val="000000"/>
           <w:sz w:val="24"/>
           <w:szCs w:val="24"/>
-        </w:rPr>
-      </w:pPr>
-      <w:bookmarkStart w:colFirst="0" w:colLast="0" w:name="_heading=h.r0i4odm0dg04" w:id="17"/>
-      <w:bookmarkEnd w:id="17"/>
-      <w:r>
+          <w:rtl w:val="0"/>
+        </w:rPr>
+        <w:t xml:space="preserve">. Bibliografía</w:t>
+      </w:r>
+      <w:r>
+        <w:rPr>
+          <w:rtl w:val="0"/>
+        </w:rPr>
+      </w:r>
+    </w:p>
+    <w:p>
+      <w:pPr>
+        <w:numPr>
+          <w:ilvl w:val="0"/>
+          <w:numId w:val="1"/>
+        </w:numPr>
+        <w:spacing w:after="0" w:afterAutospacing="0" w:line="276" w:lineRule="auto"/>
+        <w:ind w:left="720" w:hanging="360"/>
+        <w:jc w:val="both"/>
+        <w:rPr>
+          <w:rFonts w:ascii="Times New Roman" w:cs="Times New Roman" w:eastAsia="Times New Roman" w:hAnsi="Times New Roman"/>
+          <w:sz w:val="24"/>
+          <w:szCs w:val="24"/>
+          <w:u w:val="none"/>
+        </w:rPr>
+      </w:pPr>
+      <w:r>
+        <w:rPr>
+          <w:rFonts w:ascii="Times New Roman" w:cs="Times New Roman" w:eastAsia="Times New Roman" w:hAnsi="Times New Roman"/>
+          <w:sz w:val="24"/>
+          <w:szCs w:val="24"/>
+          <w:rtl w:val="0"/>
+        </w:rPr>
+        <w:t xml:space="preserve">Sánchez-Tarragó, N., &amp; Alfonso-Sánchez, I. R. (2005). Biblioteca híbrida: el bibliotecario en medio del tránsito de lo tradicional a lo moderno. </w:t>
+      </w:r>
+      <w:r>
+        <w:rPr>
+          <w:rFonts w:ascii="Times New Roman" w:cs="Times New Roman" w:eastAsia="Times New Roman" w:hAnsi="Times New Roman"/>
+          <w:i w:val="1"/>
+          <w:iCs w:val="1"/>
+          <w:sz w:val="24"/>
+          <w:szCs w:val="24"/>
+          <w:rtl w:val="0"/>
+        </w:rPr>
+        <w:t xml:space="preserve">ACIMED</w:t>
+      </w:r>
+      <w:r>
+        <w:rPr>
+          <w:rFonts w:ascii="Times New Roman" w:cs="Times New Roman" w:eastAsia="Times New Roman" w:hAnsi="Times New Roman"/>
+          <w:sz w:val="24"/>
+          <w:szCs w:val="24"/>
+          <w:rtl w:val="0"/>
+        </w:rPr>
+        <w:t xml:space="preserve">, 13(2).</w:t>
+      </w:r>
+      <w:hyperlink r:id="rId8">
+        <w:r>
+          <w:rPr>
+            <w:rFonts w:ascii="Times New Roman" w:cs="Times New Roman" w:eastAsia="Times New Roman" w:hAnsi="Times New Roman"/>
+            <w:sz w:val="24"/>
+            <w:szCs w:val="24"/>
+            <w:rtl w:val="0"/>
+          </w:rPr>
+          <w:t xml:space="preserve"> </w:t>
+        </w:r>
+      </w:hyperlink>
+      <w:hyperlink r:id="rId9">
+        <w:r>
+          <w:rPr>
+            <w:rFonts w:ascii="Times New Roman" w:cs="Times New Roman" w:eastAsia="Times New Roman" w:hAnsi="Times New Roman"/>
+            <w:color w:val="1155cc"/>
+            <w:sz w:val="24"/>
+            <w:szCs w:val="24"/>
+            <w:u w:val="single"/>
+            <w:rtl w:val="0"/>
+          </w:rPr>
+          <w:t xml:space="preserve">http://eprints.rclis.org/6474/1/Biblioteca_hibrida.pdf</w:t>
+        </w:r>
+      </w:hyperlink>
+      <w:r>
+        <w:rPr>
+          <w:rtl w:val="0"/>
+        </w:rPr>
+      </w:r>
+    </w:p>
+    <w:p>
+      <w:pPr>
+        <w:numPr>
+          <w:ilvl w:val="0"/>
+          <w:numId w:val="1"/>
+        </w:numPr>
+        <w:spacing w:after="0" w:afterAutospacing="0" w:line="276" w:lineRule="auto"/>
+        <w:ind w:left="720" w:hanging="360"/>
+        <w:jc w:val="both"/>
+        <w:rPr>
+          <w:rFonts w:ascii="Times New Roman" w:cs="Times New Roman" w:eastAsia="Times New Roman" w:hAnsi="Times New Roman"/>
+          <w:sz w:val="24"/>
+          <w:szCs w:val="24"/>
+          <w:u w:val="none"/>
+        </w:rPr>
+      </w:pPr>
+      <w:r>
+        <w:rPr>
+          <w:rFonts w:ascii="Times New Roman" w:cs="Times New Roman" w:eastAsia="Times New Roman" w:hAnsi="Times New Roman"/>
+          <w:sz w:val="24"/>
+          <w:szCs w:val="24"/>
+          <w:rtl w:val="0"/>
+        </w:rPr>
+        <w:t xml:space="preserve">Guerrero-Cedeño, M., et al. (2025). Sistemas integrados de gestión bibliotecaria en universidades: una revisión sistemática. </w:t>
+      </w:r>
+      <w:r>
+        <w:rPr>
+          <w:rFonts w:ascii="Times New Roman" w:cs="Times New Roman" w:eastAsia="Times New Roman" w:hAnsi="Times New Roman"/>
+          <w:i w:val="1"/>
+          <w:iCs w:val="1"/>
+          <w:sz w:val="24"/>
+          <w:szCs w:val="24"/>
+          <w:rtl w:val="0"/>
+        </w:rPr>
+        <w:t xml:space="preserve">Dialnet</w:t>
+      </w:r>
+      <w:r>
+        <w:rPr>
+          <w:rFonts w:ascii="Times New Roman" w:cs="Times New Roman" w:eastAsia="Times New Roman" w:hAnsi="Times New Roman"/>
+          <w:sz w:val="24"/>
+          <w:szCs w:val="24"/>
+          <w:rtl w:val="0"/>
+        </w:rPr>
+        <w:t xml:space="preserve">.</w:t>
+      </w:r>
+      <w:hyperlink r:id="rId10">
+        <w:r>
+          <w:rPr>
+            <w:rFonts w:ascii="Times New Roman" w:cs="Times New Roman" w:eastAsia="Times New Roman" w:hAnsi="Times New Roman"/>
+            <w:sz w:val="24"/>
+            <w:szCs w:val="24"/>
+            <w:rtl w:val="0"/>
+          </w:rPr>
+          <w:t xml:space="preserve"> </w:t>
+        </w:r>
+      </w:hyperlink>
+      <w:hyperlink r:id="rId11">
+        <w:r>
+          <w:rPr>
+            <w:rFonts w:ascii="Times New Roman" w:cs="Times New Roman" w:eastAsia="Times New Roman" w:hAnsi="Times New Roman"/>
+            <w:color w:val="1155cc"/>
+            <w:sz w:val="24"/>
+            <w:szCs w:val="24"/>
+            <w:u w:val="single"/>
+            <w:rtl w:val="0"/>
+          </w:rPr>
+          <w:t xml:space="preserve">https://dialnet.unirioja.es/descarga/articulo/10442413.pdf</w:t>
+        </w:r>
+      </w:hyperlink>
+      <w:r>
+        <w:rPr>
+          <w:rtl w:val="0"/>
+        </w:rPr>
+      </w:r>
+    </w:p>
+    <w:p>
+      <w:pPr>
+        <w:numPr>
+          <w:ilvl w:val="0"/>
+          <w:numId w:val="1"/>
+        </w:numPr>
+        <w:spacing w:after="240" w:line="276" w:lineRule="auto"/>
+        <w:ind w:left="720" w:hanging="360"/>
+        <w:jc w:val="both"/>
+        <w:rPr>
+          <w:rFonts w:ascii="Times New Roman" w:cs="Times New Roman" w:eastAsia="Times New Roman" w:hAnsi="Times New Roman"/>
+          <w:sz w:val="24"/>
+          <w:szCs w:val="24"/>
+          <w:u w:val="none"/>
+        </w:rPr>
+      </w:pPr>
+      <w:r>
+        <w:rPr>
+          <w:rFonts w:ascii="Times New Roman" w:cs="Times New Roman" w:eastAsia="Times New Roman" w:hAnsi="Times New Roman"/>
+          <w:sz w:val="24"/>
+          <w:szCs w:val="24"/>
+          <w:rtl w:val="0"/>
+        </w:rPr>
+        <w:t xml:space="preserve">Daramola, C. F. (2025). Exploring the impact of Digital and Physical Resources on Accessibility and Efficiency in College Libraries. </w:t>
+      </w:r>
+      <w:r>
+        <w:rPr>
+          <w:rFonts w:ascii="Times New Roman" w:cs="Times New Roman" w:eastAsia="Times New Roman" w:hAnsi="Times New Roman"/>
+          <w:i w:val="1"/>
+          <w:iCs w:val="1"/>
+          <w:sz w:val="24"/>
+          <w:szCs w:val="24"/>
+          <w:rtl w:val="0"/>
+        </w:rPr>
+        <w:t xml:space="preserve">ResearchGate</w:t>
+      </w:r>
+      <w:r>
+        <w:rPr>
+          <w:rFonts w:ascii="Times New Roman" w:cs="Times New Roman" w:eastAsia="Times New Roman" w:hAnsi="Times New Roman"/>
+          <w:sz w:val="24"/>
+          <w:szCs w:val="24"/>
+          <w:rtl w:val="0"/>
+        </w:rPr>
+        <w:t xml:space="preserve">.</w:t>
+      </w:r>
+      <w:hyperlink r:id="rId12">
+        <w:r>
+          <w:rPr>
+            <w:rFonts w:ascii="Times New Roman" w:cs="Times New Roman" w:eastAsia="Times New Roman" w:hAnsi="Times New Roman"/>
+            <w:sz w:val="24"/>
+            <w:szCs w:val="24"/>
+            <w:rtl w:val="0"/>
+          </w:rPr>
+          <w:t xml:space="preserve"> </w:t>
+        </w:r>
+      </w:hyperlink>
+      <w:hyperlink r:id="rId13">
+        <w:r>
+          <w:rPr>
+            <w:rFonts w:ascii="Times New Roman" w:cs="Times New Roman" w:eastAsia="Times New Roman" w:hAnsi="Times New Roman"/>
+            <w:color w:val="1155cc"/>
+            <w:sz w:val="24"/>
+            <w:szCs w:val="24"/>
+            <w:u w:val="single"/>
+            <w:rtl w:val="0"/>
+          </w:rPr>
+          <w:t xml:space="preserve">https://www.researchgate.net/publication/390300560_Exploring_the_impact_of_Digital_and_Physical_Resources</w:t>
+        </w:r>
+      </w:hyperlink>
+      <w:r>
+        <w:rPr>
+          <w:rtl w:val="0"/>
+        </w:rPr>
+      </w:r>
+    </w:p>
+    <w:p>
+      <w:pPr>
+        <w:ind w:left="0" w:firstLine="0"/>
+        <w:jc w:val="both"/>
+        <w:rPr>
+          <w:rFonts w:ascii="Times New Roman" w:cs="Times New Roman" w:eastAsia="Times New Roman" w:hAnsi="Times New Roman"/>
+          <w:sz w:val="24"/>
+          <w:szCs w:val="24"/>
+        </w:rPr>
+      </w:pPr>
+      <w:r>
+        <w:rPr>
+          <w:rtl w:val="0"/>
+        </w:rPr>
+      </w:r>
+    </w:p>
+    <w:p>
+      <w:pPr>
+        <w:pStyle w:val="Heading1"/>
+        <w:jc w:val="both"/>
         <w:rPr>
           <w:rFonts w:ascii="Times New Roman" w:cs="Times New Roman" w:eastAsia="Times New Roman" w:hAnsi="Times New Roman"/>
           <w:b w:val="1"/>
@@ -9032,31 +10253,11 @@
           <w:color w:val="000000"/>
           <w:sz w:val="24"/>
           <w:szCs w:val="24"/>
-          <w:rtl w:val="0"/>
-        </w:rPr>
-        <w:t xml:space="preserve">10. Bibliografía</w:t>
-      </w:r>
-    </w:p>
-    <w:p>
-      <w:pPr>
-        <w:ind w:left="0" w:firstLine="0"/>
-        <w:jc w:val="both"/>
-        <w:rPr>
-          <w:rFonts w:ascii="Times New Roman" w:cs="Times New Roman" w:eastAsia="Times New Roman" w:hAnsi="Times New Roman"/>
-          <w:sz w:val="24"/>
-          <w:szCs w:val="24"/>
-        </w:rPr>
-      </w:pPr>
-      <w:r>
-        <w:rPr>
-          <w:rtl w:val="0"/>
-        </w:rPr>
-      </w:r>
-    </w:p>
-    <w:p>
-      <w:pPr>
-        <w:pStyle w:val="Heading1"/>
-        <w:jc w:val="both"/>
+        </w:rPr>
+      </w:pPr>
+      <w:bookmarkStart w:colFirst="0" w:colLast="0" w:name="_heading=h.ypysubjoqra8" w:id="18"/>
+      <w:bookmarkEnd w:id="18"/>
+      <w:r>
         <w:rPr>
           <w:rFonts w:ascii="Times New Roman" w:cs="Times New Roman" w:eastAsia="Times New Roman" w:hAnsi="Times New Roman"/>
           <w:b w:val="1"/>
@@ -9064,18 +10265,6 @@
           <w:color w:val="000000"/>
           <w:sz w:val="24"/>
           <w:szCs w:val="24"/>
-        </w:rPr>
-      </w:pPr>
-      <w:bookmarkStart w:colFirst="0" w:colLast="0" w:name="_heading=h.ypysubjoqra8" w:id="18"/>
-      <w:bookmarkEnd w:id="18"/>
-      <w:r>
-        <w:rPr>
-          <w:rFonts w:ascii="Times New Roman" w:cs="Times New Roman" w:eastAsia="Times New Roman" w:hAnsi="Times New Roman"/>
-          <w:b w:val="1"/>
-          <w:bCs w:val="1"/>
-          <w:color w:val="000000"/>
-          <w:sz w:val="24"/>
-          <w:szCs w:val="24"/>
           <w:rtl w:val="0"/>
         </w:rPr>
         <w:t xml:space="preserve">Anexos</w:t>
@@ -9177,8 +10366,8 @@
       </w:r>
     </w:p>
     <w:sectPr>
-      <w:headerReference r:id="rId8" w:type="default"/>
-      <w:footerReference r:id="rId9" w:type="default"/>
+      <w:headerReference r:id="rId14" w:type="default"/>
+      <w:footerReference r:id="rId15" w:type="default"/>
       <w:pgSz w:h="16838" w:w="11906" w:orient="portrait"/>
       <w:pgMar w:bottom="1417" w:top="1417" w:left="1701" w:right="1701" w:header="708" w:footer="708"/>
       <w:pgNumType w:start="1"/>
@@ -9374,7 +10563,7 @@
       <w:lvlText w:val="●"/>
       <w:lvlJc w:val="left"/>
       <w:pPr>
-        <w:ind w:left="2160" w:hanging="360"/>
+        <w:ind w:left="720" w:hanging="360"/>
       </w:pPr>
       <w:rPr>
         <w:u w:val="none"/>
@@ -9386,7 +10575,7 @@
       <w:lvlText w:val="○"/>
       <w:lvlJc w:val="left"/>
       <w:pPr>
-        <w:ind w:left="2880" w:hanging="360"/>
+        <w:ind w:left="1440" w:hanging="360"/>
       </w:pPr>
       <w:rPr>
         <w:u w:val="none"/>
@@ -9398,7 +10587,7 @@
       <w:lvlText w:val="■"/>
       <w:lvlJc w:val="left"/>
       <w:pPr>
-        <w:ind w:left="3600" w:hanging="360"/>
+        <w:ind w:left="2160" w:hanging="360"/>
       </w:pPr>
       <w:rPr>
         <w:u w:val="none"/>
@@ -9410,7 +10599,7 @@
       <w:lvlText w:val="●"/>
       <w:lvlJc w:val="left"/>
       <w:pPr>
-        <w:ind w:left="4320" w:hanging="360"/>
+        <w:ind w:left="2880" w:hanging="360"/>
       </w:pPr>
       <w:rPr>
         <w:u w:val="none"/>
@@ -9422,7 +10611,7 @@
       <w:lvlText w:val="○"/>
       <w:lvlJc w:val="left"/>
       <w:pPr>
-        <w:ind w:left="5040" w:hanging="360"/>
+        <w:ind w:left="3600" w:hanging="360"/>
       </w:pPr>
       <w:rPr>
         <w:u w:val="none"/>
@@ -9434,7 +10623,7 @@
       <w:lvlText w:val="■"/>
       <w:lvlJc w:val="left"/>
       <w:pPr>
-        <w:ind w:left="5760" w:hanging="360"/>
+        <w:ind w:left="4320" w:hanging="360"/>
       </w:pPr>
       <w:rPr>
         <w:u w:val="none"/>
@@ -9446,7 +10635,7 @@
       <w:lvlText w:val="●"/>
       <w:lvlJc w:val="left"/>
       <w:pPr>
-        <w:ind w:left="6480" w:hanging="360"/>
+        <w:ind w:left="5040" w:hanging="360"/>
       </w:pPr>
       <w:rPr>
         <w:u w:val="none"/>
@@ -9458,7 +10647,7 @@
       <w:lvlText w:val="○"/>
       <w:lvlJc w:val="left"/>
       <w:pPr>
-        <w:ind w:left="7200" w:hanging="360"/>
+        <w:ind w:left="5760" w:hanging="360"/>
       </w:pPr>
       <w:rPr>
         <w:u w:val="none"/>
@@ -9470,7 +10659,7 @@
       <w:lvlText w:val="■"/>
       <w:lvlJc w:val="left"/>
       <w:pPr>
-        <w:ind w:left="7920" w:hanging="360"/>
+        <w:ind w:left="6480" w:hanging="360"/>
       </w:pPr>
       <w:rPr>
         <w:u w:val="none"/>
@@ -9594,7 +10783,7 @@
       <w:lvlText w:val="●"/>
       <w:lvlJc w:val="left"/>
       <w:pPr>
-        <w:ind w:left="1440" w:hanging="360"/>
+        <w:ind w:left="2160" w:hanging="360"/>
       </w:pPr>
       <w:rPr>
         <w:u w:val="none"/>
@@ -9606,7 +10795,7 @@
       <w:lvlText w:val="○"/>
       <w:lvlJc w:val="left"/>
       <w:pPr>
-        <w:ind w:left="2160" w:hanging="360"/>
+        <w:ind w:left="2880" w:hanging="360"/>
       </w:pPr>
       <w:rPr>
         <w:u w:val="none"/>
@@ -9618,7 +10807,7 @@
       <w:lvlText w:val="■"/>
       <w:lvlJc w:val="left"/>
       <w:pPr>
-        <w:ind w:left="2880" w:hanging="360"/>
+        <w:ind w:left="3600" w:hanging="360"/>
       </w:pPr>
       <w:rPr>
         <w:u w:val="none"/>
@@ -9630,7 +10819,7 @@
       <w:lvlText w:val="●"/>
       <w:lvlJc w:val="left"/>
       <w:pPr>
-        <w:ind w:left="3600" w:hanging="360"/>
+        <w:ind w:left="4320" w:hanging="360"/>
       </w:pPr>
       <w:rPr>
         <w:u w:val="none"/>
@@ -9642,7 +10831,7 @@
       <w:lvlText w:val="○"/>
       <w:lvlJc w:val="left"/>
       <w:pPr>
-        <w:ind w:left="4320" w:hanging="360"/>
+        <w:ind w:left="5040" w:hanging="360"/>
       </w:pPr>
       <w:rPr>
         <w:u w:val="none"/>
@@ -9654,7 +10843,7 @@
       <w:lvlText w:val="■"/>
       <w:lvlJc w:val="left"/>
       <w:pPr>
-        <w:ind w:left="5040" w:hanging="360"/>
+        <w:ind w:left="5760" w:hanging="360"/>
       </w:pPr>
       <w:rPr>
         <w:u w:val="none"/>
@@ -9666,7 +10855,7 @@
       <w:lvlText w:val="●"/>
       <w:lvlJc w:val="left"/>
       <w:pPr>
-        <w:ind w:left="5760" w:hanging="360"/>
+        <w:ind w:left="6480" w:hanging="360"/>
       </w:pPr>
       <w:rPr>
         <w:u w:val="none"/>
@@ -9678,7 +10867,7 @@
       <w:lvlText w:val="○"/>
       <w:lvlJc w:val="left"/>
       <w:pPr>
-        <w:ind w:left="6480" w:hanging="360"/>
+        <w:ind w:left="7200" w:hanging="360"/>
       </w:pPr>
       <w:rPr>
         <w:u w:val="none"/>
@@ -9690,7 +10879,7 @@
       <w:lvlText w:val="■"/>
       <w:lvlJc w:val="left"/>
       <w:pPr>
-        <w:ind w:left="7200" w:hanging="360"/>
+        <w:ind w:left="7920" w:hanging="360"/>
       </w:pPr>
       <w:rPr>
         <w:u w:val="none"/>
@@ -9704,7 +10893,7 @@
       <w:lvlText w:val="●"/>
       <w:lvlJc w:val="left"/>
       <w:pPr>
-        <w:ind w:left="1440" w:hanging="360"/>
+        <w:ind w:left="720" w:hanging="360"/>
       </w:pPr>
       <w:rPr>
         <w:u w:val="none"/>
@@ -9716,7 +10905,7 @@
       <w:lvlText w:val="○"/>
       <w:lvlJc w:val="left"/>
       <w:pPr>
-        <w:ind w:left="2160" w:hanging="360"/>
+        <w:ind w:left="1440" w:hanging="360"/>
       </w:pPr>
       <w:rPr>
         <w:u w:val="none"/>
@@ -9728,7 +10917,7 @@
       <w:lvlText w:val="■"/>
       <w:lvlJc w:val="left"/>
       <w:pPr>
-        <w:ind w:left="2880" w:hanging="360"/>
+        <w:ind w:left="2160" w:hanging="360"/>
       </w:pPr>
       <w:rPr>
         <w:u w:val="none"/>
@@ -9740,7 +10929,7 @@
       <w:lvlText w:val="●"/>
       <w:lvlJc w:val="left"/>
       <w:pPr>
-        <w:ind w:left="3600" w:hanging="360"/>
+        <w:ind w:left="2880" w:hanging="360"/>
       </w:pPr>
       <w:rPr>
         <w:u w:val="none"/>
@@ -9752,7 +10941,7 @@
       <w:lvlText w:val="○"/>
       <w:lvlJc w:val="left"/>
       <w:pPr>
-        <w:ind w:left="4320" w:hanging="360"/>
+        <w:ind w:left="3600" w:hanging="360"/>
       </w:pPr>
       <w:rPr>
         <w:u w:val="none"/>
@@ -9764,7 +10953,7 @@
       <w:lvlText w:val="■"/>
       <w:lvlJc w:val="left"/>
       <w:pPr>
-        <w:ind w:left="5040" w:hanging="360"/>
+        <w:ind w:left="4320" w:hanging="360"/>
       </w:pPr>
       <w:rPr>
         <w:u w:val="none"/>
@@ -9776,7 +10965,7 @@
       <w:lvlText w:val="●"/>
       <w:lvlJc w:val="left"/>
       <w:pPr>
-        <w:ind w:left="5760" w:hanging="360"/>
+        <w:ind w:left="5040" w:hanging="360"/>
       </w:pPr>
       <w:rPr>
         <w:u w:val="none"/>
@@ -9788,7 +10977,7 @@
       <w:lvlText w:val="○"/>
       <w:lvlJc w:val="left"/>
       <w:pPr>
-        <w:ind w:left="6480" w:hanging="360"/>
+        <w:ind w:left="5760" w:hanging="360"/>
       </w:pPr>
       <w:rPr>
         <w:u w:val="none"/>
@@ -9800,7 +10989,7 @@
       <w:lvlText w:val="■"/>
       <w:lvlJc w:val="left"/>
       <w:pPr>
-        <w:ind w:left="7200" w:hanging="360"/>
+        <w:ind w:left="6480" w:hanging="360"/>
       </w:pPr>
       <w:rPr>
         <w:u w:val="none"/>
@@ -9814,7 +11003,7 @@
       <w:lvlText w:val="●"/>
       <w:lvlJc w:val="left"/>
       <w:pPr>
-        <w:ind w:left="2160" w:hanging="360"/>
+        <w:ind w:left="1440" w:hanging="360"/>
       </w:pPr>
       <w:rPr>
         <w:u w:val="none"/>
@@ -9826,7 +11015,7 @@
       <w:lvlText w:val="○"/>
       <w:lvlJc w:val="left"/>
       <w:pPr>
-        <w:ind w:left="2880" w:hanging="360"/>
+        <w:ind w:left="2160" w:hanging="360"/>
       </w:pPr>
       <w:rPr>
         <w:u w:val="none"/>
@@ -9838,7 +11027,7 @@
       <w:lvlText w:val="■"/>
       <w:lvlJc w:val="left"/>
       <w:pPr>
-        <w:ind w:left="3600" w:hanging="360"/>
+        <w:ind w:left="2880" w:hanging="360"/>
       </w:pPr>
       <w:rPr>
         <w:u w:val="none"/>
@@ -9850,7 +11039,7 @@
       <w:lvlText w:val="●"/>
       <w:lvlJc w:val="left"/>
       <w:pPr>
-        <w:ind w:left="4320" w:hanging="360"/>
+        <w:ind w:left="3600" w:hanging="360"/>
       </w:pPr>
       <w:rPr>
         <w:u w:val="none"/>
@@ -9862,7 +11051,7 @@
       <w:lvlText w:val="○"/>
       <w:lvlJc w:val="left"/>
       <w:pPr>
-        <w:ind w:left="5040" w:hanging="360"/>
+        <w:ind w:left="4320" w:hanging="360"/>
       </w:pPr>
       <w:rPr>
         <w:u w:val="none"/>
@@ -9874,7 +11063,7 @@
       <w:lvlText w:val="■"/>
       <w:lvlJc w:val="left"/>
       <w:pPr>
-        <w:ind w:left="5760" w:hanging="360"/>
+        <w:ind w:left="5040" w:hanging="360"/>
       </w:pPr>
       <w:rPr>
         <w:u w:val="none"/>
@@ -9886,7 +11075,7 @@
       <w:lvlText w:val="●"/>
       <w:lvlJc w:val="left"/>
       <w:pPr>
-        <w:ind w:left="6480" w:hanging="360"/>
+        <w:ind w:left="5760" w:hanging="360"/>
       </w:pPr>
       <w:rPr>
         <w:u w:val="none"/>
@@ -9898,7 +11087,7 @@
       <w:lvlText w:val="○"/>
       <w:lvlJc w:val="left"/>
       <w:pPr>
-        <w:ind w:left="7200" w:hanging="360"/>
+        <w:ind w:left="6480" w:hanging="360"/>
       </w:pPr>
       <w:rPr>
         <w:u w:val="none"/>
@@ -9910,7 +11099,7 @@
       <w:lvlText w:val="■"/>
       <w:lvlJc w:val="left"/>
       <w:pPr>
-        <w:ind w:left="7920" w:hanging="360"/>
+        <w:ind w:left="7200" w:hanging="360"/>
       </w:pPr>
       <w:rPr>
         <w:u w:val="none"/>
@@ -9918,6 +11107,226 @@
     </w:lvl>
   </w:abstractNum>
   <w:abstractNum w:abstractNumId="6">
+    <w:lvl w:ilvl="0">
+      <w:start w:val="1"/>
+      <w:numFmt w:val="bullet"/>
+      <w:lvlText w:val="●"/>
+      <w:lvlJc w:val="left"/>
+      <w:pPr>
+        <w:ind w:left="1440" w:hanging="360"/>
+      </w:pPr>
+      <w:rPr>
+        <w:u w:val="none"/>
+      </w:rPr>
+    </w:lvl>
+    <w:lvl w:ilvl="1">
+      <w:start w:val="1"/>
+      <w:numFmt w:val="bullet"/>
+      <w:lvlText w:val="○"/>
+      <w:lvlJc w:val="left"/>
+      <w:pPr>
+        <w:ind w:left="2160" w:hanging="360"/>
+      </w:pPr>
+      <w:rPr>
+        <w:u w:val="none"/>
+      </w:rPr>
+    </w:lvl>
+    <w:lvl w:ilvl="2">
+      <w:start w:val="1"/>
+      <w:numFmt w:val="bullet"/>
+      <w:lvlText w:val="■"/>
+      <w:lvlJc w:val="left"/>
+      <w:pPr>
+        <w:ind w:left="2880" w:hanging="360"/>
+      </w:pPr>
+      <w:rPr>
+        <w:u w:val="none"/>
+      </w:rPr>
+    </w:lvl>
+    <w:lvl w:ilvl="3">
+      <w:start w:val="1"/>
+      <w:numFmt w:val="bullet"/>
+      <w:lvlText w:val="●"/>
+      <w:lvlJc w:val="left"/>
+      <w:pPr>
+        <w:ind w:left="3600" w:hanging="360"/>
+      </w:pPr>
+      <w:rPr>
+        <w:u w:val="none"/>
+      </w:rPr>
+    </w:lvl>
+    <w:lvl w:ilvl="4">
+      <w:start w:val="1"/>
+      <w:numFmt w:val="bullet"/>
+      <w:lvlText w:val="○"/>
+      <w:lvlJc w:val="left"/>
+      <w:pPr>
+        <w:ind w:left="4320" w:hanging="360"/>
+      </w:pPr>
+      <w:rPr>
+        <w:u w:val="none"/>
+      </w:rPr>
+    </w:lvl>
+    <w:lvl w:ilvl="5">
+      <w:start w:val="1"/>
+      <w:numFmt w:val="bullet"/>
+      <w:lvlText w:val="■"/>
+      <w:lvlJc w:val="left"/>
+      <w:pPr>
+        <w:ind w:left="5040" w:hanging="360"/>
+      </w:pPr>
+      <w:rPr>
+        <w:u w:val="none"/>
+      </w:rPr>
+    </w:lvl>
+    <w:lvl w:ilvl="6">
+      <w:start w:val="1"/>
+      <w:numFmt w:val="bullet"/>
+      <w:lvlText w:val="●"/>
+      <w:lvlJc w:val="left"/>
+      <w:pPr>
+        <w:ind w:left="5760" w:hanging="360"/>
+      </w:pPr>
+      <w:rPr>
+        <w:u w:val="none"/>
+      </w:rPr>
+    </w:lvl>
+    <w:lvl w:ilvl="7">
+      <w:start w:val="1"/>
+      <w:numFmt w:val="bullet"/>
+      <w:lvlText w:val="○"/>
+      <w:lvlJc w:val="left"/>
+      <w:pPr>
+        <w:ind w:left="6480" w:hanging="360"/>
+      </w:pPr>
+      <w:rPr>
+        <w:u w:val="none"/>
+      </w:rPr>
+    </w:lvl>
+    <w:lvl w:ilvl="8">
+      <w:start w:val="1"/>
+      <w:numFmt w:val="bullet"/>
+      <w:lvlText w:val="■"/>
+      <w:lvlJc w:val="left"/>
+      <w:pPr>
+        <w:ind w:left="7200" w:hanging="360"/>
+      </w:pPr>
+      <w:rPr>
+        <w:u w:val="none"/>
+      </w:rPr>
+    </w:lvl>
+  </w:abstractNum>
+  <w:abstractNum w:abstractNumId="7">
+    <w:lvl w:ilvl="0">
+      <w:start w:val="1"/>
+      <w:numFmt w:val="bullet"/>
+      <w:lvlText w:val="●"/>
+      <w:lvlJc w:val="left"/>
+      <w:pPr>
+        <w:ind w:left="2160" w:hanging="360"/>
+      </w:pPr>
+      <w:rPr>
+        <w:u w:val="none"/>
+      </w:rPr>
+    </w:lvl>
+    <w:lvl w:ilvl="1">
+      <w:start w:val="1"/>
+      <w:numFmt w:val="bullet"/>
+      <w:lvlText w:val="○"/>
+      <w:lvlJc w:val="left"/>
+      <w:pPr>
+        <w:ind w:left="2880" w:hanging="360"/>
+      </w:pPr>
+      <w:rPr>
+        <w:u w:val="none"/>
+      </w:rPr>
+    </w:lvl>
+    <w:lvl w:ilvl="2">
+      <w:start w:val="1"/>
+      <w:numFmt w:val="bullet"/>
+      <w:lvlText w:val="■"/>
+      <w:lvlJc w:val="left"/>
+      <w:pPr>
+        <w:ind w:left="3600" w:hanging="360"/>
+      </w:pPr>
+      <w:rPr>
+        <w:u w:val="none"/>
+      </w:rPr>
+    </w:lvl>
+    <w:lvl w:ilvl="3">
+      <w:start w:val="1"/>
+      <w:numFmt w:val="bullet"/>
+      <w:lvlText w:val="●"/>
+      <w:lvlJc w:val="left"/>
+      <w:pPr>
+        <w:ind w:left="4320" w:hanging="360"/>
+      </w:pPr>
+      <w:rPr>
+        <w:u w:val="none"/>
+      </w:rPr>
+    </w:lvl>
+    <w:lvl w:ilvl="4">
+      <w:start w:val="1"/>
+      <w:numFmt w:val="bullet"/>
+      <w:lvlText w:val="○"/>
+      <w:lvlJc w:val="left"/>
+      <w:pPr>
+        <w:ind w:left="5040" w:hanging="360"/>
+      </w:pPr>
+      <w:rPr>
+        <w:u w:val="none"/>
+      </w:rPr>
+    </w:lvl>
+    <w:lvl w:ilvl="5">
+      <w:start w:val="1"/>
+      <w:numFmt w:val="bullet"/>
+      <w:lvlText w:val="■"/>
+      <w:lvlJc w:val="left"/>
+      <w:pPr>
+        <w:ind w:left="5760" w:hanging="360"/>
+      </w:pPr>
+      <w:rPr>
+        <w:u w:val="none"/>
+      </w:rPr>
+    </w:lvl>
+    <w:lvl w:ilvl="6">
+      <w:start w:val="1"/>
+      <w:numFmt w:val="bullet"/>
+      <w:lvlText w:val="●"/>
+      <w:lvlJc w:val="left"/>
+      <w:pPr>
+        <w:ind w:left="6480" w:hanging="360"/>
+      </w:pPr>
+      <w:rPr>
+        <w:u w:val="none"/>
+      </w:rPr>
+    </w:lvl>
+    <w:lvl w:ilvl="7">
+      <w:start w:val="1"/>
+      <w:numFmt w:val="bullet"/>
+      <w:lvlText w:val="○"/>
+      <w:lvlJc w:val="left"/>
+      <w:pPr>
+        <w:ind w:left="7200" w:hanging="360"/>
+      </w:pPr>
+      <w:rPr>
+        <w:u w:val="none"/>
+      </w:rPr>
+    </w:lvl>
+    <w:lvl w:ilvl="8">
+      <w:start w:val="1"/>
+      <w:numFmt w:val="bullet"/>
+      <w:lvlText w:val="■"/>
+      <w:lvlJc w:val="left"/>
+      <w:pPr>
+        <w:ind w:left="7920" w:hanging="360"/>
+      </w:pPr>
+      <w:rPr>
+        <w:u w:val="none"/>
+      </w:rPr>
+    </w:lvl>
+  </w:abstractNum>
+  <w:abstractNum w:abstractNumId="8">
     <w:lvl w:ilvl="0">
       <w:start w:val="1"/>
       <w:numFmt w:val="bullet"/>
@@ -10044,6 +11453,12 @@
   </w:num>
   <w:num w:numId="6">
     <w:abstractNumId w:val="6"/>
+  </w:num>
+  <w:num w:numId="7">
+    <w:abstractNumId w:val="7"/>
+  </w:num>
+  <w:num w:numId="8">
+    <w:abstractNumId w:val="8"/>
   </w:num>
 </w:numbering>
 </file>
@@ -10269,6 +11684,19 @@
     <w:tblPr>
       <w:tblStyleRowBandSize w:val="1"/>
       <w:tblStyleColBandSize w:val="1"/>
+    </w:tblPr>
+  </w:style>
+  <w:style w:type="table" w:styleId="Table8">
+    <w:basedOn w:val="TableNormal"/>
+    <w:tblPr>
+      <w:tblStyleRowBandSize w:val="1"/>
+      <w:tblStyleColBandSize w:val="1"/>
+      <w:tblCellMar>
+        <w:top w:w="100.0" w:type="dxa"/>
+        <w:left w:w="100.0" w:type="dxa"/>
+        <w:bottom w:w="100.0" w:type="dxa"/>
+        <w:right w:w="100.0" w:type="dxa"/>
+      </w:tblCellMar>
     </w:tblPr>
   </w:style>
 </w:styles>
@@ -10596,7 +12024,7 @@
 
 <file path=customXML/item1.xml><?xml version="1.0" encoding="utf-8"?>
 <go:gDocsCustomXmlDataStorage xmlns:go="http://customooxmlschemas.google.com/" xmlns:r="http://schemas.openxmlformats.org/officeDocument/2006/relationships" uri="GoogleDocsCustomDataVersion2">
-  <go:docsCustomData xmlns:go="http://customooxmlschemas.google.com/" roundtripDataSignature="AMtx7mgoa+IMwbwIXcrs9kkCSrB2Jv0lLA==">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</go:docsCustomData>
+  <go:docsCustomData xmlns:go="http://customooxmlschemas.google.com/" roundtripDataSignature="AMtx7mhDJ5aSzREg7Nsr3FwPye+VjqRaAg==">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</go:docsCustomData>
 </go:gDocsCustomXmlDataStorage>
 </file>
 

</xml_diff>